<commit_message>
format: update font to Times New Roman 12pt with 1.5 line spacing
</commit_message>
<xml_diff>
--- a/LBL_Hosieries_IWP_Report.docx
+++ b/LBL_Hosieries_IWP_Report.docx
@@ -4,12 +4,12 @@
   <w:body>
     <w:p>
       <w:pPr>
-        <w:spacing w:before="1000" w:after="80"/>
+        <w:spacing w:before="900" w:after="60"/>
       </w:pPr>
     </w:p>
     <w:p>
       <w:pPr>
-        <w:spacing w:after="240"/>
+        <w:spacing w:line="312" w:lineRule="auto"/>
         <w:jc w:val="center"/>
       </w:pPr>
       <w:r>
@@ -22,7 +22,7 @@
     </w:p>
     <w:p>
       <w:pPr>
-        <w:spacing w:after="480"/>
+        <w:spacing w:after="440" w:line="312" w:lineRule="auto"/>
         <w:jc w:val="center"/>
       </w:pPr>
       <w:r>
@@ -35,21 +35,20 @@
     </w:p>
     <w:p>
       <w:pPr>
-        <w:spacing w:after="80"/>
+        <w:spacing w:after="80" w:line="288" w:lineRule="auto"/>
         <w:jc w:val="center"/>
       </w:pPr>
       <w:r>
         <w:rPr>
           <w:b/>
           <w:color w:val="A0822D"/>
-          <w:sz w:val="24"/>
         </w:rPr>
         <w:t>U21AM502</w:t>
       </w:r>
     </w:p>
     <w:p>
       <w:pPr>
-        <w:spacing w:after="960"/>
+        <w:spacing w:after="880" w:line="288" w:lineRule="auto"/>
         <w:jc w:val="center"/>
       </w:pPr>
       <w:r>
@@ -63,7 +62,7 @@
     </w:p>
     <w:p>
       <w:pPr>
-        <w:spacing w:after="1080"/>
+        <w:spacing w:after="1000" w:line="288" w:lineRule="auto"/>
         <w:jc w:val="center"/>
       </w:pPr>
       <w:r>
@@ -77,6 +76,7 @@
     </w:p>
     <w:p>
       <w:pPr>
+        <w:spacing w:line="312" w:lineRule="auto"/>
         <w:jc w:val="center"/>
       </w:pPr>
       <w:r>
@@ -89,52 +89,48 @@
     </w:p>
     <w:p>
       <w:pPr>
-        <w:spacing w:after="120"/>
+        <w:spacing w:after="120" w:line="300" w:lineRule="auto"/>
         <w:jc w:val="center"/>
       </w:pPr>
       <w:r>
         <w:rPr>
           <w:i/>
-          <w:sz w:val="22"/>
         </w:rPr>
         <w:t>Technical Architecture, Zero-Database Engineering, and System Implementation Report</w:t>
       </w:r>
     </w:p>
     <w:p>
       <w:pPr>
-        <w:spacing w:after="1600"/>
+        <w:spacing w:after="1400" w:line="300" w:lineRule="auto"/>
         <w:jc w:val="center"/>
       </w:pPr>
       <w:r>
         <w:rPr>
           <w:i/>
-          <w:sz w:val="22"/>
         </w:rPr>
         <w:t>Interactive Manufacturing Journey, Floating Glassmorphism, and Real-Time Logistics Docketing</w:t>
       </w:r>
     </w:p>
     <w:p>
       <w:pPr>
-        <w:spacing w:after="120"/>
+        <w:spacing w:after="120" w:line="288" w:lineRule="auto"/>
         <w:jc w:val="center"/>
       </w:pPr>
       <w:r>
         <w:rPr>
           <w:b/>
-          <w:sz w:val="24"/>
         </w:rPr>
         <w:t>LIHASH L B – 24AM023</w:t>
       </w:r>
     </w:p>
     <w:p>
       <w:pPr>
-        <w:spacing w:after="0"/>
+        <w:spacing w:after="0" w:line="288" w:lineRule="auto"/>
         <w:jc w:val="center"/>
       </w:pPr>
       <w:r>
         <w:rPr>
           <w:b/>
-          <w:sz w:val="24"/>
         </w:rPr>
         <w:t>MOHAMMED SUHAIL A R – 24AM025</w:t>
       </w:r>
@@ -146,7 +142,7 @@
     </w:p>
     <w:p>
       <w:pPr>
-        <w:spacing w:before="80" w:after="80"/>
+        <w:spacing w:before="40" w:after="60" w:line="300" w:lineRule="auto"/>
       </w:pPr>
       <w:r>
         <w:rPr>
@@ -160,7 +156,7 @@
     </w:p>
     <w:p>
       <w:pPr>
-        <w:spacing w:before="80" w:after="160"/>
+        <w:spacing w:before="40" w:after="120"/>
         <w:jc w:val="both"/>
       </w:pPr>
       <w:r>
@@ -172,7 +168,7 @@
     </w:p>
     <w:p>
       <w:pPr>
-        <w:spacing w:before="80" w:after="160"/>
+        <w:spacing w:before="40" w:after="120"/>
         <w:jc w:val="both"/>
       </w:pPr>
       <w:r>
@@ -187,7 +183,7 @@
     </w:p>
     <w:p>
       <w:pPr>
-        <w:spacing w:before="80" w:after="280"/>
+        <w:spacing w:before="40"/>
         <w:jc w:val="both"/>
       </w:pPr>
       <w:r>
@@ -196,21 +192,21 @@
     </w:p>
     <w:p>
       <w:pPr>
-        <w:spacing w:after="80"/>
+        <w:spacing w:before="40" w:after="40"/>
         <w:jc w:val="both"/>
       </w:pPr>
       <w:r>
         <w:rPr>
           <w:b/>
           <w:i/>
-          <w:sz w:val="20"/>
+          <w:sz w:val="22"/>
         </w:rPr>
         <w:t xml:space="preserve">Keywords: </w:t>
       </w:r>
       <w:r>
         <w:rPr>
           <w:i/>
-          <w:sz w:val="20"/>
+          <w:sz w:val="22"/>
         </w:rPr>
         <w:t>Textile Scrollytelling, Zero-Database Architecture, Floating Glassmorphism, B2B Wholesale Logistics, Combed Cotton Manufacturing, Dynamic Viewport Crossfades, Tiruppur Knitwear Informatics, Static JAMstack, Web Performance Optimization.</w:t>
       </w:r>
@@ -222,7 +218,7 @@
     </w:p>
     <w:p>
       <w:pPr>
-        <w:spacing w:before="80" w:after="80"/>
+        <w:spacing w:before="40" w:after="60" w:line="300" w:lineRule="auto"/>
       </w:pPr>
       <w:r>
         <w:rPr>
@@ -236,7 +232,7 @@
     </w:p>
     <w:p>
       <w:pPr>
-        <w:spacing w:before="80" w:after="160"/>
+        <w:spacing w:before="40" w:after="100"/>
         <w:jc w:val="both"/>
       </w:pPr>
       <w:r>
@@ -245,7 +241,7 @@
     </w:p>
     <w:p>
       <w:pPr>
-        <w:spacing w:before="40" w:after="80"/>
+        <w:spacing w:before="20" w:after="60"/>
         <w:ind w:left="360"/>
         <w:jc w:val="both"/>
       </w:pPr>
@@ -261,7 +257,7 @@
     </w:p>
     <w:p>
       <w:pPr>
-        <w:spacing w:before="40" w:after="80"/>
+        <w:spacing w:before="20" w:after="60"/>
         <w:ind w:left="360"/>
         <w:jc w:val="both"/>
       </w:pPr>
@@ -283,7 +279,7 @@
     </w:p>
     <w:p>
       <w:pPr>
-        <w:spacing w:before="40" w:after="80"/>
+        <w:spacing w:before="20" w:after="60"/>
         <w:ind w:left="360"/>
         <w:jc w:val="both"/>
       </w:pPr>
@@ -305,7 +301,7 @@
     </w:p>
     <w:p>
       <w:pPr>
-        <w:spacing w:before="40" w:after="80"/>
+        <w:spacing w:before="20" w:after="60"/>
         <w:ind w:left="360"/>
         <w:jc w:val="both"/>
       </w:pPr>
@@ -326,7 +322,7 @@
     </w:p>
     <w:p>
       <w:pPr>
-        <w:spacing w:before="40" w:after="80"/>
+        <w:spacing w:before="20" w:after="60"/>
         <w:ind w:left="360"/>
         <w:jc w:val="both"/>
       </w:pPr>
@@ -343,7 +339,7 @@
     </w:p>
     <w:p>
       <w:pPr>
-        <w:spacing w:before="40" w:after="80"/>
+        <w:spacing w:before="20" w:after="60"/>
         <w:ind w:left="360"/>
         <w:jc w:val="both"/>
       </w:pPr>
@@ -359,7 +355,7 @@
     </w:p>
     <w:p>
       <w:pPr>
-        <w:spacing w:before="80" w:after="80"/>
+        <w:spacing w:before="40" w:after="60" w:line="300" w:lineRule="auto"/>
       </w:pPr>
       <w:r>
         <w:rPr>
@@ -372,7 +368,7 @@
     </w:p>
     <w:p>
       <w:pPr>
-        <w:spacing w:before="80" w:after="160"/>
+        <w:spacing w:before="40" w:after="100"/>
         <w:jc w:val="both"/>
       </w:pPr>
       <w:r>
@@ -389,7 +385,7 @@
       <w:tblGrid>
         <w:gridCol w:w="2304"/>
         <w:gridCol w:w="2592"/>
-        <w:gridCol w:w="4896"/>
+        <w:gridCol w:w="5040"/>
       </w:tblGrid>
       <w:tr>
         <w:trPr>
@@ -400,18 +396,21 @@
             <w:tcW w:w="2304" w:type="dxa"/>
             <w:shd w:val="clear" w:color="auto" w:fill="101B2B"/>
             <w:tcMar>
-              <w:top w:w="100" w:type="dxa"/>
-              <w:left w:w="120" w:type="dxa"/>
-              <w:bottom w:w="100" w:type="dxa"/>
-              <w:right w:w="120" w:type="dxa"/>
+              <w:top w:w="80" w:type="dxa"/>
+              <w:left w:w="100" w:type="dxa"/>
+              <w:bottom w:w="80" w:type="dxa"/>
+              <w:right w:w="100" w:type="dxa"/>
             </w:tcMar>
           </w:tcPr>
           <w:p>
+            <w:pPr>
+              <w:spacing w:line="288" w:lineRule="auto"/>
+            </w:pPr>
             <w:r>
               <w:rPr>
                 <w:b/>
                 <w:color w:val="FFFFFF"/>
-                <w:sz w:val="19"/>
+                <w:sz w:val="21"/>
               </w:rPr>
               <w:t>Technology Stack</w:t>
             </w:r>
@@ -422,18 +421,21 @@
             <w:tcW w:w="2592" w:type="dxa"/>
             <w:shd w:val="clear" w:color="auto" w:fill="101B2B"/>
             <w:tcMar>
-              <w:top w:w="100" w:type="dxa"/>
-              <w:left w:w="120" w:type="dxa"/>
-              <w:bottom w:w="100" w:type="dxa"/>
-              <w:right w:w="120" w:type="dxa"/>
+              <w:top w:w="80" w:type="dxa"/>
+              <w:left w:w="100" w:type="dxa"/>
+              <w:bottom w:w="80" w:type="dxa"/>
+              <w:right w:w="100" w:type="dxa"/>
             </w:tcMar>
           </w:tcPr>
           <w:p>
+            <w:pPr>
+              <w:spacing w:line="288" w:lineRule="auto"/>
+            </w:pPr>
             <w:r>
               <w:rPr>
                 <w:b/>
                 <w:color w:val="FFFFFF"/>
-                <w:sz w:val="19"/>
+                <w:sz w:val="21"/>
               </w:rPr>
               <w:t>Standard / Engine</w:t>
             </w:r>
@@ -441,21 +443,24 @@
         </w:tc>
         <w:tc>
           <w:tcPr>
-            <w:tcW w:w="4896" w:type="dxa"/>
+            <w:tcW w:w="5040" w:type="dxa"/>
             <w:shd w:val="clear" w:color="auto" w:fill="101B2B"/>
             <w:tcMar>
-              <w:top w:w="100" w:type="dxa"/>
-              <w:left w:w="120" w:type="dxa"/>
-              <w:bottom w:w="100" w:type="dxa"/>
-              <w:right w:w="120" w:type="dxa"/>
+              <w:top w:w="80" w:type="dxa"/>
+              <w:left w:w="100" w:type="dxa"/>
+              <w:bottom w:w="80" w:type="dxa"/>
+              <w:right w:w="100" w:type="dxa"/>
             </w:tcMar>
           </w:tcPr>
           <w:p>
+            <w:pPr>
+              <w:spacing w:line="288" w:lineRule="auto"/>
+            </w:pPr>
             <w:r>
               <w:rPr>
                 <w:b/>
                 <w:color w:val="FFFFFF"/>
-                <w:sz w:val="19"/>
+                <w:sz w:val="21"/>
               </w:rPr>
               <w:t>Architectural Role &amp; Functional Justification</w:t>
             </w:r>
@@ -477,18 +482,21 @@
             </w:tcBorders>
             <w:shd w:val="clear" w:color="auto" w:fill="FFFFFF"/>
             <w:tcMar>
-              <w:top w:w="80" w:type="dxa"/>
-              <w:left w:w="100" w:type="dxa"/>
-              <w:bottom w:w="80" w:type="dxa"/>
-              <w:right w:w="100" w:type="dxa"/>
+              <w:top w:w="60" w:type="dxa"/>
+              <w:left w:w="80" w:type="dxa"/>
+              <w:bottom w:w="60" w:type="dxa"/>
+              <w:right w:w="80" w:type="dxa"/>
             </w:tcMar>
           </w:tcPr>
           <w:p>
+            <w:pPr>
+              <w:spacing w:line="288" w:lineRule="auto"/>
+            </w:pPr>
             <w:r>
               <w:rPr>
                 <w:b/>
                 <w:color w:val="1E293B"/>
-                <w:sz w:val="18"/>
+                <w:sz w:val="19"/>
               </w:rPr>
               <w:t>Semantic HTML5</w:t>
             </w:r>
@@ -505,17 +513,20 @@
             </w:tcBorders>
             <w:shd w:val="clear" w:color="auto" w:fill="FFFFFF"/>
             <w:tcMar>
-              <w:top w:w="80" w:type="dxa"/>
-              <w:left w:w="100" w:type="dxa"/>
-              <w:bottom w:w="80" w:type="dxa"/>
-              <w:right w:w="100" w:type="dxa"/>
+              <w:top w:w="60" w:type="dxa"/>
+              <w:left w:w="80" w:type="dxa"/>
+              <w:bottom w:w="60" w:type="dxa"/>
+              <w:right w:w="80" w:type="dxa"/>
             </w:tcMar>
           </w:tcPr>
           <w:p>
+            <w:pPr>
+              <w:spacing w:line="288" w:lineRule="auto"/>
+            </w:pPr>
             <w:r>
               <w:rPr>
                 <w:color w:val="1E293B"/>
-                <w:sz w:val="18"/>
+                <w:sz w:val="19"/>
               </w:rPr>
               <w:t>W3C HTML5 Specification</w:t>
             </w:r>
@@ -523,7 +534,7 @@
         </w:tc>
         <w:tc>
           <w:tcPr>
-            <w:tcW w:w="4896" w:type="dxa"/>
+            <w:tcW w:w="5040" w:type="dxa"/>
             <w:tcBorders>
               <w:top w:val="single" w:sz="4" w:space="0" w:color="E2E8F0"/>
               <w:left w:val="single" w:sz="4" w:space="0" w:color="E2E8F0"/>
@@ -532,17 +543,20 @@
             </w:tcBorders>
             <w:shd w:val="clear" w:color="auto" w:fill="FFFFFF"/>
             <w:tcMar>
-              <w:top w:w="80" w:type="dxa"/>
-              <w:left w:w="100" w:type="dxa"/>
-              <w:bottom w:w="80" w:type="dxa"/>
-              <w:right w:w="100" w:type="dxa"/>
+              <w:top w:w="60" w:type="dxa"/>
+              <w:left w:w="80" w:type="dxa"/>
+              <w:bottom w:w="60" w:type="dxa"/>
+              <w:right w:w="80" w:type="dxa"/>
             </w:tcMar>
           </w:tcPr>
           <w:p>
+            <w:pPr>
+              <w:spacing w:line="288" w:lineRule="auto"/>
+            </w:pPr>
             <w:r>
               <w:rPr>
                 <w:color w:val="1E293B"/>
-                <w:sz w:val="18"/>
+                <w:sz w:val="19"/>
               </w:rPr>
               <w:t>Establishes structured B2B documentation hierarchy (&lt;header&gt;, &lt;nav&gt;, &lt;main&gt;, &lt;section&gt;, &lt;article&gt;, &lt;footer&gt;, &lt;dialog&gt;), Open Graph metadata, and custom data attributes (`data-step`) for scrollytelling triggers.</w:t>
             </w:r>
@@ -564,18 +578,21 @@
             </w:tcBorders>
             <w:shd w:val="clear" w:color="auto" w:fill="F8FAFC"/>
             <w:tcMar>
-              <w:top w:w="80" w:type="dxa"/>
-              <w:left w:w="100" w:type="dxa"/>
-              <w:bottom w:w="80" w:type="dxa"/>
-              <w:right w:w="100" w:type="dxa"/>
+              <w:top w:w="60" w:type="dxa"/>
+              <w:left w:w="80" w:type="dxa"/>
+              <w:bottom w:w="60" w:type="dxa"/>
+              <w:right w:w="80" w:type="dxa"/>
             </w:tcMar>
           </w:tcPr>
           <w:p>
+            <w:pPr>
+              <w:spacing w:line="288" w:lineRule="auto"/>
+            </w:pPr>
             <w:r>
               <w:rPr>
                 <w:b/>
                 <w:color w:val="1E293B"/>
-                <w:sz w:val="18"/>
+                <w:sz w:val="19"/>
               </w:rPr>
               <w:t>Vanilla CSS3 (Design Tokens Engine)</w:t>
             </w:r>
@@ -592,17 +609,20 @@
             </w:tcBorders>
             <w:shd w:val="clear" w:color="auto" w:fill="F8FAFC"/>
             <w:tcMar>
-              <w:top w:w="80" w:type="dxa"/>
-              <w:left w:w="100" w:type="dxa"/>
-              <w:bottom w:w="80" w:type="dxa"/>
-              <w:right w:w="100" w:type="dxa"/>
+              <w:top w:w="60" w:type="dxa"/>
+              <w:left w:w="80" w:type="dxa"/>
+              <w:bottom w:w="60" w:type="dxa"/>
+              <w:right w:w="80" w:type="dxa"/>
             </w:tcMar>
           </w:tcPr>
           <w:p>
+            <w:pPr>
+              <w:spacing w:line="288" w:lineRule="auto"/>
+            </w:pPr>
             <w:r>
               <w:rPr>
                 <w:color w:val="1E293B"/>
-                <w:sz w:val="18"/>
+                <w:sz w:val="19"/>
               </w:rPr>
               <w:t>CSS Custom Properties (`:root`)</w:t>
             </w:r>
@@ -610,7 +630,7 @@
         </w:tc>
         <w:tc>
           <w:tcPr>
-            <w:tcW w:w="4896" w:type="dxa"/>
+            <w:tcW w:w="5040" w:type="dxa"/>
             <w:tcBorders>
               <w:top w:val="single" w:sz="4" w:space="0" w:color="E2E8F0"/>
               <w:left w:val="single" w:sz="4" w:space="0" w:color="E2E8F0"/>
@@ -619,17 +639,20 @@
             </w:tcBorders>
             <w:shd w:val="clear" w:color="auto" w:fill="F8FAFC"/>
             <w:tcMar>
-              <w:top w:w="80" w:type="dxa"/>
-              <w:left w:w="100" w:type="dxa"/>
-              <w:bottom w:w="80" w:type="dxa"/>
-              <w:right w:w="100" w:type="dxa"/>
+              <w:top w:w="60" w:type="dxa"/>
+              <w:left w:w="80" w:type="dxa"/>
+              <w:bottom w:w="60" w:type="dxa"/>
+              <w:right w:w="80" w:type="dxa"/>
             </w:tcMar>
           </w:tcPr>
           <w:p>
+            <w:pPr>
+              <w:spacing w:line="288" w:lineRule="auto"/>
+            </w:pPr>
             <w:r>
               <w:rPr>
                 <w:color w:val="1E293B"/>
-                <w:sz w:val="18"/>
+                <w:sz w:val="19"/>
               </w:rPr>
               <w:t>Powers an editorial textile design system without external CSS frameworks (no Tailwind or Bootstrap). Implements sticky 100vh stages, glassmorphism backdrop filters, smooth keyframes, and fluid responsive media queries.</w:t>
             </w:r>
@@ -651,18 +674,21 @@
             </w:tcBorders>
             <w:shd w:val="clear" w:color="auto" w:fill="FFFFFF"/>
             <w:tcMar>
-              <w:top w:w="80" w:type="dxa"/>
-              <w:left w:w="100" w:type="dxa"/>
-              <w:bottom w:w="80" w:type="dxa"/>
-              <w:right w:w="100" w:type="dxa"/>
+              <w:top w:w="60" w:type="dxa"/>
+              <w:left w:w="80" w:type="dxa"/>
+              <w:bottom w:w="60" w:type="dxa"/>
+              <w:right w:w="80" w:type="dxa"/>
             </w:tcMar>
           </w:tcPr>
           <w:p>
+            <w:pPr>
+              <w:spacing w:line="288" w:lineRule="auto"/>
+            </w:pPr>
             <w:r>
               <w:rPr>
                 <w:b/>
                 <w:color w:val="1E293B"/>
-                <w:sz w:val="18"/>
+                <w:sz w:val="19"/>
               </w:rPr>
               <w:t>Vanilla JavaScript (ES6+)</w:t>
             </w:r>
@@ -679,17 +705,20 @@
             </w:tcBorders>
             <w:shd w:val="clear" w:color="auto" w:fill="FFFFFF"/>
             <w:tcMar>
-              <w:top w:w="80" w:type="dxa"/>
-              <w:left w:w="100" w:type="dxa"/>
-              <w:bottom w:w="80" w:type="dxa"/>
-              <w:right w:w="100" w:type="dxa"/>
+              <w:top w:w="60" w:type="dxa"/>
+              <w:left w:w="80" w:type="dxa"/>
+              <w:bottom w:w="60" w:type="dxa"/>
+              <w:right w:w="80" w:type="dxa"/>
             </w:tcMar>
           </w:tcPr>
           <w:p>
+            <w:pPr>
+              <w:spacing w:line="288" w:lineRule="auto"/>
+            </w:pPr>
             <w:r>
               <w:rPr>
                 <w:color w:val="1E293B"/>
-                <w:sz w:val="18"/>
+                <w:sz w:val="19"/>
               </w:rPr>
               <w:t>Native Browser Engine (Zero Frameworks)</w:t>
             </w:r>
@@ -697,7 +726,7 @@
         </w:tc>
         <w:tc>
           <w:tcPr>
-            <w:tcW w:w="4896" w:type="dxa"/>
+            <w:tcW w:w="5040" w:type="dxa"/>
             <w:tcBorders>
               <w:top w:val="single" w:sz="4" w:space="0" w:color="E2E8F0"/>
               <w:left w:val="single" w:sz="4" w:space="0" w:color="E2E8F0"/>
@@ -706,17 +735,20 @@
             </w:tcBorders>
             <w:shd w:val="clear" w:color="auto" w:fill="FFFFFF"/>
             <w:tcMar>
-              <w:top w:w="80" w:type="dxa"/>
-              <w:left w:w="100" w:type="dxa"/>
-              <w:bottom w:w="80" w:type="dxa"/>
-              <w:right w:w="100" w:type="dxa"/>
+              <w:top w:w="60" w:type="dxa"/>
+              <w:left w:w="80" w:type="dxa"/>
+              <w:bottom w:w="60" w:type="dxa"/>
+              <w:right w:w="80" w:type="dxa"/>
             </w:tcMar>
           </w:tcPr>
           <w:p>
+            <w:pPr>
+              <w:spacing w:line="288" w:lineRule="auto"/>
+            </w:pPr>
             <w:r>
               <w:rPr>
                 <w:color w:val="1E293B"/>
-                <w:sz w:val="18"/>
+                <w:sz w:val="19"/>
               </w:rPr>
               <w:t>Drives all dynamic user interactions: IntersectionObserver narrative scroll controller, shade swatch DOM style mutation, wholesale pricing tier matrix calculations, and WhatsApp trade docket validation.</w:t>
             </w:r>
@@ -738,18 +770,21 @@
             </w:tcBorders>
             <w:shd w:val="clear" w:color="auto" w:fill="F8FAFC"/>
             <w:tcMar>
-              <w:top w:w="80" w:type="dxa"/>
-              <w:left w:w="100" w:type="dxa"/>
-              <w:bottom w:w="80" w:type="dxa"/>
-              <w:right w:w="100" w:type="dxa"/>
+              <w:top w:w="60" w:type="dxa"/>
+              <w:left w:w="80" w:type="dxa"/>
+              <w:bottom w:w="60" w:type="dxa"/>
+              <w:right w:w="80" w:type="dxa"/>
             </w:tcMar>
           </w:tcPr>
           <w:p>
+            <w:pPr>
+              <w:spacing w:line="288" w:lineRule="auto"/>
+            </w:pPr>
             <w:r>
               <w:rPr>
                 <w:b/>
                 <w:color w:val="1E293B"/>
-                <w:sz w:val="18"/>
+                <w:sz w:val="19"/>
               </w:rPr>
               <w:t>Scalable Vector Graphics (SVG)</w:t>
             </w:r>
@@ -766,17 +801,20 @@
             </w:tcBorders>
             <w:shd w:val="clear" w:color="auto" w:fill="F8FAFC"/>
             <w:tcMar>
-              <w:top w:w="80" w:type="dxa"/>
-              <w:left w:w="100" w:type="dxa"/>
-              <w:bottom w:w="80" w:type="dxa"/>
-              <w:right w:w="100" w:type="dxa"/>
+              <w:top w:w="60" w:type="dxa"/>
+              <w:left w:w="80" w:type="dxa"/>
+              <w:bottom w:w="60" w:type="dxa"/>
+              <w:right w:w="80" w:type="dxa"/>
             </w:tcMar>
           </w:tcPr>
           <w:p>
+            <w:pPr>
+              <w:spacing w:line="288" w:lineRule="auto"/>
+            </w:pPr>
             <w:r>
               <w:rPr>
                 <w:color w:val="1E293B"/>
-                <w:sz w:val="18"/>
+                <w:sz w:val="19"/>
               </w:rPr>
               <w:t>Inline XML Vector Mathematics</w:t>
             </w:r>
@@ -784,7 +822,7 @@
         </w:tc>
         <w:tc>
           <w:tcPr>
-            <w:tcW w:w="4896" w:type="dxa"/>
+            <w:tcW w:w="5040" w:type="dxa"/>
             <w:tcBorders>
               <w:top w:val="single" w:sz="4" w:space="0" w:color="E2E8F0"/>
               <w:left w:val="single" w:sz="4" w:space="0" w:color="E2E8F0"/>
@@ -793,17 +831,20 @@
             </w:tcBorders>
             <w:shd w:val="clear" w:color="auto" w:fill="F8FAFC"/>
             <w:tcMar>
-              <w:top w:w="80" w:type="dxa"/>
-              <w:left w:w="100" w:type="dxa"/>
-              <w:bottom w:w="80" w:type="dxa"/>
-              <w:right w:w="100" w:type="dxa"/>
+              <w:top w:w="60" w:type="dxa"/>
+              <w:left w:w="80" w:type="dxa"/>
+              <w:bottom w:w="60" w:type="dxa"/>
+              <w:right w:w="80" w:type="dxa"/>
             </w:tcMar>
           </w:tcPr>
           <w:p>
+            <w:pPr>
+              <w:spacing w:line="288" w:lineRule="auto"/>
+            </w:pPr>
             <w:r>
               <w:rPr>
                 <w:color w:val="1E293B"/>
-                <w:sz w:val="18"/>
+                <w:sz w:val="19"/>
               </w:rPr>
               <w:t>Renders mathematically crisp textile iconography: yarn spindles, knit loops, cotton bolls, precision needles, and dynamic mannequin wireframes with zero pixelation at retina and 4K display resolutions.</w:t>
             </w:r>
@@ -826,7 +867,7 @@
       <w:tblGrid>
         <w:gridCol w:w="2304"/>
         <w:gridCol w:w="2592"/>
-        <w:gridCol w:w="4896"/>
+        <w:gridCol w:w="5040"/>
       </w:tblGrid>
       <w:tr>
         <w:trPr>
@@ -837,18 +878,21 @@
             <w:tcW w:w="2304" w:type="dxa"/>
             <w:shd w:val="clear" w:color="auto" w:fill="101B2B"/>
             <w:tcMar>
-              <w:top w:w="100" w:type="dxa"/>
-              <w:left w:w="120" w:type="dxa"/>
-              <w:bottom w:w="100" w:type="dxa"/>
-              <w:right w:w="120" w:type="dxa"/>
+              <w:top w:w="80" w:type="dxa"/>
+              <w:left w:w="100" w:type="dxa"/>
+              <w:bottom w:w="80" w:type="dxa"/>
+              <w:right w:w="100" w:type="dxa"/>
             </w:tcMar>
           </w:tcPr>
           <w:p>
+            <w:pPr>
+              <w:spacing w:line="288" w:lineRule="auto"/>
+            </w:pPr>
             <w:r>
               <w:rPr>
                 <w:b/>
                 <w:color w:val="FFFFFF"/>
-                <w:sz w:val="19"/>
+                <w:sz w:val="21"/>
               </w:rPr>
               <w:lastRenderedPageBreak/>
               <w:t>Technology Stack</w:t>
@@ -860,18 +904,21 @@
             <w:tcW w:w="2592" w:type="dxa"/>
             <w:shd w:val="clear" w:color="auto" w:fill="101B2B"/>
             <w:tcMar>
-              <w:top w:w="100" w:type="dxa"/>
-              <w:left w:w="120" w:type="dxa"/>
-              <w:bottom w:w="100" w:type="dxa"/>
-              <w:right w:w="120" w:type="dxa"/>
+              <w:top w:w="80" w:type="dxa"/>
+              <w:left w:w="100" w:type="dxa"/>
+              <w:bottom w:w="80" w:type="dxa"/>
+              <w:right w:w="100" w:type="dxa"/>
             </w:tcMar>
           </w:tcPr>
           <w:p>
+            <w:pPr>
+              <w:spacing w:line="288" w:lineRule="auto"/>
+            </w:pPr>
             <w:r>
               <w:rPr>
                 <w:b/>
                 <w:color w:val="FFFFFF"/>
-                <w:sz w:val="19"/>
+                <w:sz w:val="21"/>
               </w:rPr>
               <w:t>Standard / Engine</w:t>
             </w:r>
@@ -879,21 +926,24 @@
         </w:tc>
         <w:tc>
           <w:tcPr>
-            <w:tcW w:w="4896" w:type="dxa"/>
+            <w:tcW w:w="5040" w:type="dxa"/>
             <w:shd w:val="clear" w:color="auto" w:fill="101B2B"/>
             <w:tcMar>
-              <w:top w:w="100" w:type="dxa"/>
-              <w:left w:w="120" w:type="dxa"/>
-              <w:bottom w:w="100" w:type="dxa"/>
-              <w:right w:w="120" w:type="dxa"/>
+              <w:top w:w="80" w:type="dxa"/>
+              <w:left w:w="100" w:type="dxa"/>
+              <w:bottom w:w="80" w:type="dxa"/>
+              <w:right w:w="100" w:type="dxa"/>
             </w:tcMar>
           </w:tcPr>
           <w:p>
+            <w:pPr>
+              <w:spacing w:line="288" w:lineRule="auto"/>
+            </w:pPr>
             <w:r>
               <w:rPr>
                 <w:b/>
                 <w:color w:val="FFFFFF"/>
-                <w:sz w:val="19"/>
+                <w:sz w:val="21"/>
               </w:rPr>
               <w:t>Architectural Role &amp; Functional Justification</w:t>
             </w:r>
@@ -915,18 +965,21 @@
             </w:tcBorders>
             <w:shd w:val="clear" w:color="auto" w:fill="FFFFFF"/>
             <w:tcMar>
-              <w:top w:w="80" w:type="dxa"/>
-              <w:left w:w="100" w:type="dxa"/>
-              <w:bottom w:w="80" w:type="dxa"/>
-              <w:right w:w="100" w:type="dxa"/>
+              <w:top w:w="60" w:type="dxa"/>
+              <w:left w:w="80" w:type="dxa"/>
+              <w:bottom w:w="60" w:type="dxa"/>
+              <w:right w:w="80" w:type="dxa"/>
             </w:tcMar>
           </w:tcPr>
           <w:p>
+            <w:pPr>
+              <w:spacing w:line="288" w:lineRule="auto"/>
+            </w:pPr>
             <w:r>
               <w:rPr>
                 <w:b/>
                 <w:color w:val="1E293B"/>
-                <w:sz w:val="18"/>
+                <w:sz w:val="19"/>
               </w:rPr>
               <w:t>Curated Typography Stack</w:t>
             </w:r>
@@ -943,17 +996,20 @@
             </w:tcBorders>
             <w:shd w:val="clear" w:color="auto" w:fill="FFFFFF"/>
             <w:tcMar>
-              <w:top w:w="80" w:type="dxa"/>
-              <w:left w:w="100" w:type="dxa"/>
-              <w:bottom w:w="80" w:type="dxa"/>
-              <w:right w:w="100" w:type="dxa"/>
+              <w:top w:w="60" w:type="dxa"/>
+              <w:left w:w="80" w:type="dxa"/>
+              <w:bottom w:w="60" w:type="dxa"/>
+              <w:right w:w="80" w:type="dxa"/>
             </w:tcMar>
           </w:tcPr>
           <w:p>
+            <w:pPr>
+              <w:spacing w:line="288" w:lineRule="auto"/>
+            </w:pPr>
             <w:r>
               <w:rPr>
                 <w:color w:val="1E293B"/>
-                <w:sz w:val="18"/>
+                <w:sz w:val="19"/>
               </w:rPr>
               <w:t>Google Fonts CDN Integration</w:t>
             </w:r>
@@ -961,7 +1017,7 @@
         </w:tc>
         <w:tc>
           <w:tcPr>
-            <w:tcW w:w="4896" w:type="dxa"/>
+            <w:tcW w:w="5040" w:type="dxa"/>
             <w:tcBorders>
               <w:top w:val="single" w:sz="4" w:space="0" w:color="E2E8F0"/>
               <w:left w:val="single" w:sz="4" w:space="0" w:color="E2E8F0"/>
@@ -970,17 +1026,20 @@
             </w:tcBorders>
             <w:shd w:val="clear" w:color="auto" w:fill="FFFFFF"/>
             <w:tcMar>
-              <w:top w:w="80" w:type="dxa"/>
-              <w:left w:w="100" w:type="dxa"/>
-              <w:bottom w:w="80" w:type="dxa"/>
-              <w:right w:w="100" w:type="dxa"/>
+              <w:top w:w="60" w:type="dxa"/>
+              <w:left w:w="80" w:type="dxa"/>
+              <w:bottom w:w="60" w:type="dxa"/>
+              <w:right w:w="80" w:type="dxa"/>
             </w:tcMar>
           </w:tcPr>
           <w:p>
+            <w:pPr>
+              <w:spacing w:line="288" w:lineRule="auto"/>
+            </w:pPr>
             <w:r>
               <w:rPr>
                 <w:color w:val="1E293B"/>
-                <w:sz w:val="18"/>
+                <w:sz w:val="19"/>
               </w:rPr>
               <w:t>A cohesive typographic hierarchy: Cormorant Garamond / Playfair Display for editorial luxury, Cinzel for mill badges and section headers, and Inter / Plus Jakarta Sans for dense technical specification tables.</w:t>
             </w:r>
@@ -1002,18 +1061,21 @@
             </w:tcBorders>
             <w:shd w:val="clear" w:color="auto" w:fill="F8FAFC"/>
             <w:tcMar>
-              <w:top w:w="80" w:type="dxa"/>
-              <w:left w:w="100" w:type="dxa"/>
-              <w:bottom w:w="80" w:type="dxa"/>
-              <w:right w:w="100" w:type="dxa"/>
+              <w:top w:w="60" w:type="dxa"/>
+              <w:left w:w="80" w:type="dxa"/>
+              <w:bottom w:w="60" w:type="dxa"/>
+              <w:right w:w="80" w:type="dxa"/>
             </w:tcMar>
           </w:tcPr>
           <w:p>
+            <w:pPr>
+              <w:spacing w:line="288" w:lineRule="auto"/>
+            </w:pPr>
             <w:r>
               <w:rPr>
                 <w:b/>
                 <w:color w:val="1E293B"/>
-                <w:sz w:val="18"/>
+                <w:sz w:val="19"/>
               </w:rPr>
               <w:t>Edge Static CDN Infrastructure</w:t>
             </w:r>
@@ -1030,17 +1092,20 @@
             </w:tcBorders>
             <w:shd w:val="clear" w:color="auto" w:fill="F8FAFC"/>
             <w:tcMar>
-              <w:top w:w="80" w:type="dxa"/>
-              <w:left w:w="100" w:type="dxa"/>
-              <w:bottom w:w="80" w:type="dxa"/>
-              <w:right w:w="100" w:type="dxa"/>
+              <w:top w:w="60" w:type="dxa"/>
+              <w:left w:w="80" w:type="dxa"/>
+              <w:bottom w:w="60" w:type="dxa"/>
+              <w:right w:w="80" w:type="dxa"/>
             </w:tcMar>
           </w:tcPr>
           <w:p>
+            <w:pPr>
+              <w:spacing w:line="288" w:lineRule="auto"/>
+            </w:pPr>
             <w:r>
               <w:rPr>
                 <w:color w:val="1E293B"/>
-                <w:sz w:val="18"/>
+                <w:sz w:val="19"/>
               </w:rPr>
               <w:t>GitHub Pages / Cloudflare Edge CDN</w:t>
             </w:r>
@@ -1048,7 +1113,7 @@
         </w:tc>
         <w:tc>
           <w:tcPr>
-            <w:tcW w:w="4896" w:type="dxa"/>
+            <w:tcW w:w="5040" w:type="dxa"/>
             <w:tcBorders>
               <w:top w:val="single" w:sz="4" w:space="0" w:color="E2E8F0"/>
               <w:left w:val="single" w:sz="4" w:space="0" w:color="E2E8F0"/>
@@ -1057,17 +1122,20 @@
             </w:tcBorders>
             <w:shd w:val="clear" w:color="auto" w:fill="F8FAFC"/>
             <w:tcMar>
-              <w:top w:w="80" w:type="dxa"/>
-              <w:left w:w="100" w:type="dxa"/>
-              <w:bottom w:w="80" w:type="dxa"/>
-              <w:right w:w="100" w:type="dxa"/>
+              <w:top w:w="60" w:type="dxa"/>
+              <w:left w:w="80" w:type="dxa"/>
+              <w:bottom w:w="60" w:type="dxa"/>
+              <w:right w:w="80" w:type="dxa"/>
             </w:tcMar>
           </w:tcPr>
           <w:p>
+            <w:pPr>
+              <w:spacing w:line="288" w:lineRule="auto"/>
+            </w:pPr>
             <w:r>
               <w:rPr>
                 <w:color w:val="1E293B"/>
-                <w:sz w:val="18"/>
+                <w:sz w:val="19"/>
               </w:rPr>
               <w:t>Ensures sub-second global asset delivery via distributed Edge PoPs, HTTP/2 multiplexing, automatic SSL termination, and 99.99% uptime with permanent zero-cost hosting.</w:t>
             </w:r>
@@ -1089,18 +1157,21 @@
             </w:tcBorders>
             <w:shd w:val="clear" w:color="auto" w:fill="FFFFFF"/>
             <w:tcMar>
-              <w:top w:w="80" w:type="dxa"/>
-              <w:left w:w="100" w:type="dxa"/>
-              <w:bottom w:w="80" w:type="dxa"/>
-              <w:right w:w="100" w:type="dxa"/>
+              <w:top w:w="60" w:type="dxa"/>
+              <w:left w:w="80" w:type="dxa"/>
+              <w:bottom w:w="60" w:type="dxa"/>
+              <w:right w:w="80" w:type="dxa"/>
             </w:tcMar>
           </w:tcPr>
           <w:p>
+            <w:pPr>
+              <w:spacing w:line="288" w:lineRule="auto"/>
+            </w:pPr>
             <w:r>
               <w:rPr>
                 <w:b/>
                 <w:color w:val="1E293B"/>
-                <w:sz w:val="18"/>
+                <w:sz w:val="19"/>
               </w:rPr>
               <w:t>Testing &amp; Build Automation</w:t>
             </w:r>
@@ -1117,17 +1188,20 @@
             </w:tcBorders>
             <w:shd w:val="clear" w:color="auto" w:fill="FFFFFF"/>
             <w:tcMar>
-              <w:top w:w="80" w:type="dxa"/>
-              <w:left w:w="100" w:type="dxa"/>
-              <w:bottom w:w="80" w:type="dxa"/>
-              <w:right w:w="100" w:type="dxa"/>
+              <w:top w:w="60" w:type="dxa"/>
+              <w:left w:w="80" w:type="dxa"/>
+              <w:bottom w:w="60" w:type="dxa"/>
+              <w:right w:w="80" w:type="dxa"/>
             </w:tcMar>
           </w:tcPr>
           <w:p>
+            <w:pPr>
+              <w:spacing w:line="288" w:lineRule="auto"/>
+            </w:pPr>
             <w:r>
               <w:rPr>
                 <w:color w:val="1E293B"/>
-                <w:sz w:val="18"/>
+                <w:sz w:val="19"/>
               </w:rPr>
               <w:t>Python 3 &amp; Windows PowerShell</w:t>
             </w:r>
@@ -1135,7 +1209,7 @@
         </w:tc>
         <w:tc>
           <w:tcPr>
-            <w:tcW w:w="4896" w:type="dxa"/>
+            <w:tcW w:w="5040" w:type="dxa"/>
             <w:tcBorders>
               <w:top w:val="single" w:sz="4" w:space="0" w:color="E2E8F0"/>
               <w:left w:val="single" w:sz="4" w:space="0" w:color="E2E8F0"/>
@@ -1144,17 +1218,20 @@
             </w:tcBorders>
             <w:shd w:val="clear" w:color="auto" w:fill="FFFFFF"/>
             <w:tcMar>
-              <w:top w:w="80" w:type="dxa"/>
-              <w:left w:w="100" w:type="dxa"/>
-              <w:bottom w:w="80" w:type="dxa"/>
-              <w:right w:w="100" w:type="dxa"/>
+              <w:top w:w="60" w:type="dxa"/>
+              <w:left w:w="80" w:type="dxa"/>
+              <w:bottom w:w="60" w:type="dxa"/>
+              <w:right w:w="80" w:type="dxa"/>
             </w:tcMar>
           </w:tcPr>
           <w:p>
+            <w:pPr>
+              <w:spacing w:line="288" w:lineRule="auto"/>
+            </w:pPr>
             <w:r>
               <w:rPr>
                 <w:color w:val="1E293B"/>
-                <w:sz w:val="18"/>
+                <w:sz w:val="19"/>
               </w:rPr>
               <w:t>Automated Lighthouse performance auditing, docx/pdf publication report generators, and Windows Word COM object statistical inspectors.</w:t>
             </w:r>
@@ -1164,7 +1241,7 @@
     </w:tbl>
     <w:p>
       <w:pPr>
-        <w:spacing w:before="80" w:after="80"/>
+        <w:spacing w:before="40" w:after="60" w:line="300" w:lineRule="auto"/>
       </w:pPr>
       <w:r>
         <w:rPr>
@@ -1177,20 +1254,19 @@
     </w:p>
     <w:p>
       <w:pPr>
-        <w:spacing w:before="80" w:after="60"/>
+        <w:spacing w:before="40" w:after="40" w:line="300" w:lineRule="auto"/>
       </w:pPr>
       <w:r>
         <w:rPr>
           <w:b/>
           <w:color w:val="0F172A"/>
-          <w:sz w:val="23"/>
         </w:rPr>
         <w:t>4.1 3-Tier Static JAMstack Model &amp; Litigant/Buyer Confidentiality Pipeline</w:t>
       </w:r>
     </w:p>
     <w:p>
       <w:pPr>
-        <w:spacing w:before="60" w:after="120"/>
+        <w:spacing w:before="40" w:after="80"/>
         <w:jc w:val="both"/>
       </w:pPr>
       <w:r>
@@ -1205,8 +1281,8 @@
         <w:tblLook w:val="04A0" w:firstRow="1" w:lastRow="0" w:firstColumn="1" w:lastColumn="0" w:noHBand="0" w:noVBand="1"/>
       </w:tblPr>
       <w:tblGrid>
-        <w:gridCol w:w="4968"/>
-        <w:gridCol w:w="4968"/>
+        <w:gridCol w:w="5040"/>
+        <w:gridCol w:w="5040"/>
       </w:tblGrid>
       <w:tr>
         <w:trPr>
@@ -1214,7 +1290,7 @@
         </w:trPr>
         <w:tc>
           <w:tcPr>
-            <w:tcW w:w="4968" w:type="dxa"/>
+            <w:tcW w:w="5040" w:type="dxa"/>
           </w:tcPr>
           <w:p>
             <w:pPr>
@@ -1225,8 +1301,8 @@
                 <w:noProof/>
               </w:rPr>
               <w:drawing>
-                <wp:inline distT="0" distB="0" distL="0" distR="0" wp14:anchorId="1819E9AE" wp14:editId="352663BF">
-                  <wp:extent cx="2926080" cy="1045029"/>
+                <wp:inline distT="0" distB="0" distL="0" distR="0" wp14:anchorId="236EE767" wp14:editId="70B028B7">
+                  <wp:extent cx="2880360" cy="1028700"/>
                   <wp:effectExtent l="0" t="0" r="0" b="0"/>
                   <wp:docPr id="1" name="Picture 1"/>
                   <wp:cNvGraphicFramePr>
@@ -1248,7 +1324,7 @@
                         <pic:spPr>
                           <a:xfrm>
                             <a:off x="0" y="0"/>
-                            <a:ext cx="2926080" cy="1045029"/>
+                            <a:ext cx="2880360" cy="1028700"/>
                           </a:xfrm>
                           <a:prstGeom prst="rect">
                             <a:avLst/>
@@ -1264,7 +1340,7 @@
         </w:tc>
         <w:tc>
           <w:tcPr>
-            <w:tcW w:w="4968" w:type="dxa"/>
+            <w:tcW w:w="5040" w:type="dxa"/>
           </w:tcPr>
           <w:p>
             <w:pPr>
@@ -1275,8 +1351,8 @@
                 <w:noProof/>
               </w:rPr>
               <w:drawing>
-                <wp:inline distT="0" distB="0" distL="0" distR="0" wp14:anchorId="1CCD5E52" wp14:editId="0DA831A8">
-                  <wp:extent cx="2926080" cy="1045029"/>
+                <wp:inline distT="0" distB="0" distL="0" distR="0" wp14:anchorId="3116ED91" wp14:editId="57A49B88">
+                  <wp:extent cx="2880360" cy="1028700"/>
                   <wp:effectExtent l="0" t="0" r="0" b="0"/>
                   <wp:docPr id="2" name="Picture 2"/>
                   <wp:cNvGraphicFramePr>
@@ -1298,7 +1374,7 @@
                         <pic:spPr>
                           <a:xfrm>
                             <a:off x="0" y="0"/>
-                            <a:ext cx="2926080" cy="1045029"/>
+                            <a:ext cx="2880360" cy="1028700"/>
                           </a:xfrm>
                           <a:prstGeom prst="rect">
                             <a:avLst/>
@@ -1316,33 +1392,32 @@
     </w:tbl>
     <w:p>
       <w:pPr>
-        <w:spacing w:before="40" w:after="80"/>
+        <w:spacing w:before="20" w:after="40"/>
         <w:jc w:val="center"/>
       </w:pPr>
       <w:r>
         <w:rPr>
           <w:i/>
-          <w:sz w:val="18"/>
+          <w:sz w:val="20"/>
         </w:rPr>
         <w:t>Figure 4.1: 3-Tier Static JAMstack Architecture          Figure 4.2: Zero-Database Docket Data Pipeline</w:t>
       </w:r>
     </w:p>
     <w:p>
       <w:pPr>
-        <w:spacing w:before="80" w:after="60"/>
+        <w:spacing w:before="40" w:after="40" w:line="300" w:lineRule="auto"/>
       </w:pPr>
       <w:r>
         <w:rPr>
           <w:b/>
           <w:color w:val="0F172A"/>
-          <w:sz w:val="23"/>
         </w:rPr>
         <w:t>4.2 Pinned Viewport Scrollytelling Pipeline &amp; Editorial State Engine</w:t>
       </w:r>
     </w:p>
     <w:p>
       <w:pPr>
-        <w:spacing w:before="40" w:after="80"/>
+        <w:spacing w:before="40" w:after="40"/>
         <w:jc w:val="both"/>
       </w:pPr>
       <w:r>
@@ -1356,7 +1431,7 @@
     </w:p>
     <w:p>
       <w:pPr>
-        <w:spacing w:before="80" w:after="80"/>
+        <w:spacing w:before="40" w:after="60" w:line="300" w:lineRule="auto"/>
       </w:pPr>
       <w:r>
         <w:rPr>
@@ -1370,7 +1445,7 @@
     </w:p>
     <w:p>
       <w:pPr>
-        <w:spacing w:before="40" w:after="80"/>
+        <w:spacing w:before="20" w:after="60"/>
         <w:jc w:val="both"/>
       </w:pPr>
       <w:r>
@@ -1379,13 +1454,12 @@
     </w:p>
     <w:p>
       <w:pPr>
-        <w:spacing w:before="80" w:after="60"/>
+        <w:spacing w:before="40" w:after="40" w:line="300" w:lineRule="auto"/>
       </w:pPr>
       <w:r>
         <w:rPr>
           <w:b/>
           <w:color w:val="0F172A"/>
-          <w:sz w:val="23"/>
         </w:rPr>
         <w:t>5.1 Floating Glassmorphic Top Navigation Island</w:t>
       </w:r>
@@ -1398,7 +1472,7 @@
         <w:tblLook w:val="04A0" w:firstRow="1" w:lastRow="0" w:firstColumn="1" w:lastColumn="0" w:noHBand="0" w:noVBand="1"/>
       </w:tblPr>
       <w:tblGrid>
-        <w:gridCol w:w="9936"/>
+        <w:gridCol w:w="10080"/>
       </w:tblGrid>
       <w:tr>
         <w:trPr>
@@ -1406,7 +1480,7 @@
         </w:trPr>
         <w:tc>
           <w:tcPr>
-            <w:tcW w:w="9936" w:type="dxa"/>
+            <w:tcW w:w="10080" w:type="dxa"/>
             <w:tcBorders>
               <w:top w:val="single" w:sz="6" w:space="0" w:color="2B3545"/>
               <w:left w:val="single" w:sz="6" w:space="0" w:color="2B3545"/>
@@ -1415,15 +1489,15 @@
             </w:tcBorders>
             <w:shd w:val="clear" w:color="auto" w:fill="FBFBFD"/>
             <w:tcMar>
-              <w:top w:w="100" w:type="dxa"/>
-              <w:left w:w="140" w:type="dxa"/>
-              <w:bottom w:w="100" w:type="dxa"/>
-              <w:right w:w="140" w:type="dxa"/>
+              <w:top w:w="80" w:type="dxa"/>
+              <w:left w:w="120" w:type="dxa"/>
+              <w:bottom w:w="80" w:type="dxa"/>
+              <w:right w:w="120" w:type="dxa"/>
             </w:tcMar>
           </w:tcPr>
           <w:p>
             <w:pPr>
-              <w:spacing w:after="60" w:line="252" w:lineRule="auto"/>
+              <w:spacing w:after="40" w:line="252" w:lineRule="auto"/>
             </w:pPr>
             <w:r>
               <w:rPr>
@@ -1448,7 +1522,7 @@
                 <w:rFonts w:ascii="Consolas" w:hAnsi="Consolas"/>
                 <w:i/>
                 <w:color w:val="5A6978"/>
-                <w:sz w:val="16"/>
+                <w:sz w:val="15"/>
               </w:rPr>
               <w:t>/* Glassmorphic Floating Top Nav Island */</w:t>
             </w:r>
@@ -1457,7 +1531,7 @@
                 <w:rFonts w:ascii="Consolas" w:hAnsi="Consolas"/>
                 <w:i/>
                 <w:color w:val="5A6978"/>
-                <w:sz w:val="16"/>
+                <w:sz w:val="15"/>
               </w:rPr>
               <w:br/>
             </w:r>
@@ -1465,7 +1539,7 @@
               <w:rPr>
                 <w:rFonts w:ascii="Consolas" w:hAnsi="Consolas"/>
                 <w:color w:val="1E293B"/>
-                <w:sz w:val="16"/>
+                <w:sz w:val="15"/>
               </w:rPr>
               <w:t>.glass-nav-island {</w:t>
             </w:r>
@@ -1473,95 +1547,68 @@
               <w:rPr>
                 <w:rFonts w:ascii="Consolas" w:hAnsi="Consolas"/>
                 <w:color w:val="1E293B"/>
-                <w:sz w:val="16"/>
+                <w:sz w:val="15"/>
               </w:rPr>
               <w:br/>
-              <w:t xml:space="preserve">  position: fixed; top: 1.25rem; left: 50%;</w:t>
+              <w:t xml:space="preserve">  position: fixed; top: 1.25rem; left: 50%; transform: translateX(-50%);</w:t>
             </w:r>
             <w:r>
               <w:rPr>
                 <w:rFonts w:ascii="Consolas" w:hAnsi="Consolas"/>
                 <w:color w:val="1E293B"/>
-                <w:sz w:val="16"/>
+                <w:sz w:val="15"/>
               </w:rPr>
               <w:br/>
-              <w:t xml:space="preserve">  transform: translateX(-50%);</w:t>
             </w:r>
             <w:r>
               <w:rPr>
                 <w:rFonts w:ascii="Consolas" w:hAnsi="Consolas"/>
                 <w:color w:val="1E293B"/>
-                <w:sz w:val="16"/>
-              </w:rPr>
-              <w:br/>
+                <w:sz w:val="15"/>
+              </w:rPr>
+              <w:t xml:space="preserve">  backdrop-filter: blur(16px); -webkit-backdrop-filter: blur(16px);</w:t>
             </w:r>
             <w:r>
               <w:rPr>
                 <w:rFonts w:ascii="Consolas" w:hAnsi="Consolas"/>
                 <w:color w:val="1E293B"/>
-                <w:sz w:val="16"/>
-              </w:rPr>
-              <w:t xml:space="preserve">  backdrop-filter: blur(16px); -webkit-backdrop-filter: blur(16px);</w:t>
+                <w:sz w:val="15"/>
+              </w:rPr>
+              <w:br/>
+              <w:t xml:space="preserve">  background: rgba(255, 255, 255, 0.78); border: 1px solid rgba(229, 231, 235, 0.85);</w:t>
             </w:r>
             <w:r>
               <w:rPr>
                 <w:rFonts w:ascii="Consolas" w:hAnsi="Consolas"/>
                 <w:color w:val="1E293B"/>
-                <w:sz w:val="16"/>
+                <w:sz w:val="15"/>
               </w:rPr>
               <w:br/>
-              <w:t xml:space="preserve">  background: rgba(255, 255, 255, 0.78);</w:t>
+              <w:t xml:space="preserve">  border-radius: 9999px; box-shadow: 0 10px 25px -5px rgba(0, 0, 0, 0.06);</w:t>
             </w:r>
             <w:r>
               <w:rPr>
                 <w:rFonts w:ascii="Consolas" w:hAnsi="Consolas"/>
                 <w:color w:val="1E293B"/>
-                <w:sz w:val="16"/>
+                <w:sz w:val="15"/>
               </w:rPr>
               <w:br/>
-              <w:t xml:space="preserve">  border: 1px solid rgba(229, 231, 235, 0.85);</w:t>
+              <w:t xml:space="preserve">  z-index: 1000; transition: all 0.3s cubic-bezier(0.16, 1, 0.3, 1);</w:t>
             </w:r>
             <w:r>
               <w:rPr>
                 <w:rFonts w:ascii="Consolas" w:hAnsi="Consolas"/>
                 <w:color w:val="1E293B"/>
-                <w:sz w:val="16"/>
+                <w:sz w:val="15"/>
               </w:rPr>
               <w:br/>
-              <w:t xml:space="preserve">  border-radius: 9999px;</w:t>
+              <w:t>}</w:t>
             </w:r>
             <w:r>
               <w:rPr>
                 <w:rFonts w:ascii="Consolas" w:hAnsi="Consolas"/>
                 <w:color w:val="1E293B"/>
-                <w:sz w:val="16"/>
-              </w:rPr>
-              <w:br/>
-              <w:t xml:space="preserve">  box-shadow: 0 10px 25px -5px rgba(0, 0, 0, 0.06);</w:t>
-            </w:r>
-            <w:r>
-              <w:rPr>
-                <w:rFonts w:ascii="Consolas" w:hAnsi="Consolas"/>
-                <w:color w:val="1E293B"/>
-                <w:sz w:val="16"/>
-              </w:rPr>
-              <w:br/>
-              <w:t xml:space="preserve">  z-index: 1000; transition: all 0.3s cubic-bezier(0.16, 1, 0.3, 1);</w:t>
-            </w:r>
-            <w:r>
-              <w:rPr>
-                <w:rFonts w:ascii="Consolas" w:hAnsi="Consolas"/>
-                <w:color w:val="1E293B"/>
-                <w:sz w:val="16"/>
-              </w:rPr>
-              <w:br/>
-              <w:t>}</w:t>
-            </w:r>
-            <w:r>
-              <w:rPr>
-                <w:rFonts w:ascii="Consolas" w:hAnsi="Consolas"/>
-                <w:color w:val="1E293B"/>
-                <w:sz w:val="16"/>
+                <w:sz w:val="15"/>
               </w:rPr>
               <w:br/>
             </w:r>
@@ -1570,7 +1617,7 @@
                 <w:rFonts w:ascii="Consolas" w:hAnsi="Consolas"/>
                 <w:b/>
                 <w:color w:val="10326E"/>
-                <w:sz w:val="16"/>
+                <w:sz w:val="15"/>
               </w:rPr>
               <w:t>window.addEventListener('scroll', () =&gt; {</w:t>
             </w:r>
@@ -1579,7 +1626,7 @@
                 <w:rFonts w:ascii="Consolas" w:hAnsi="Consolas"/>
                 <w:b/>
                 <w:color w:val="10326E"/>
-                <w:sz w:val="16"/>
+                <w:sz w:val="15"/>
               </w:rPr>
               <w:br/>
               <w:t xml:space="preserve">  const nav = document.querySelector('.glass-nav-island');</w:t>
@@ -1589,7 +1636,7 @@
                 <w:rFonts w:ascii="Consolas" w:hAnsi="Consolas"/>
                 <w:b/>
                 <w:color w:val="10326E"/>
-                <w:sz w:val="16"/>
+                <w:sz w:val="15"/>
               </w:rPr>
               <w:br/>
             </w:r>
@@ -1597,7 +1644,7 @@
               <w:rPr>
                 <w:rFonts w:ascii="Consolas" w:hAnsi="Consolas"/>
                 <w:color w:val="1E293B"/>
-                <w:sz w:val="16"/>
+                <w:sz w:val="15"/>
               </w:rPr>
               <w:t xml:space="preserve">  if (window.scrollY &gt; 80) nav.classList.add('scrolled-condensed');</w:t>
             </w:r>
@@ -1605,7 +1652,7 @@
               <w:rPr>
                 <w:rFonts w:ascii="Consolas" w:hAnsi="Consolas"/>
                 <w:color w:val="1E293B"/>
-                <w:sz w:val="16"/>
+                <w:sz w:val="15"/>
               </w:rPr>
               <w:br/>
             </w:r>
@@ -1613,7 +1660,7 @@
               <w:rPr>
                 <w:rFonts w:ascii="Consolas" w:hAnsi="Consolas"/>
                 <w:color w:val="1E293B"/>
-                <w:sz w:val="16"/>
+                <w:sz w:val="15"/>
               </w:rPr>
               <w:t xml:space="preserve">  else nav.classList.remove('scrolled-condensed');</w:t>
             </w:r>
@@ -1621,7 +1668,7 @@
               <w:rPr>
                 <w:rFonts w:ascii="Consolas" w:hAnsi="Consolas"/>
                 <w:color w:val="1E293B"/>
-                <w:sz w:val="16"/>
+                <w:sz w:val="15"/>
               </w:rPr>
               <w:br/>
               <w:t>});</w:t>
@@ -1637,28 +1684,28 @@
     </w:p>
     <w:p>
       <w:pPr>
-        <w:spacing w:before="60" w:after="80"/>
+        <w:spacing w:before="40" w:after="60"/>
         <w:jc w:val="both"/>
       </w:pPr>
       <w:r>
         <w:rPr>
           <w:b/>
           <w:i/>
-          <w:sz w:val="19"/>
+          <w:sz w:val="23"/>
         </w:rPr>
         <w:t xml:space="preserve">Technical Insight: </w:t>
       </w:r>
       <w:r>
         <w:rPr>
           <w:i/>
-          <w:sz w:val="19"/>
+          <w:sz w:val="23"/>
         </w:rPr>
         <w:t>Implements a centered, floating pill navigation bar with backdrop blur and responsive shrink/shadow state adjustments upon scroll, providing persistent brand identity and instant jump navigation.</w:t>
       </w:r>
     </w:p>
     <w:p>
       <w:pPr>
-        <w:spacing w:before="80" w:after="60"/>
+        <w:spacing w:before="40" w:after="40"/>
         <w:jc w:val="center"/>
       </w:pPr>
       <w:r>
@@ -1666,8 +1713,8 @@
           <w:noProof/>
         </w:rPr>
         <w:drawing>
-          <wp:inline distT="0" distB="0" distL="0" distR="0" wp14:anchorId="0885A08C" wp14:editId="096CDC47">
-            <wp:extent cx="4846320" cy="1526591"/>
+          <wp:inline distT="0" distB="0" distL="0" distR="0" wp14:anchorId="60EF91A9" wp14:editId="61B3F7C1">
+            <wp:extent cx="4663440" cy="1468984"/>
             <wp:effectExtent l="0" t="0" r="0" b="0"/>
             <wp:docPr id="3" name="Picture 3"/>
             <wp:cNvGraphicFramePr>
@@ -1689,7 +1736,7 @@
                   <pic:spPr>
                     <a:xfrm>
                       <a:off x="0" y="0"/>
-                      <a:ext cx="4846320" cy="1526591"/>
+                      <a:ext cx="4663440" cy="1468984"/>
                     </a:xfrm>
                     <a:prstGeom prst="rect">
                       <a:avLst/>
@@ -1704,14 +1751,14 @@
     </w:p>
     <w:p>
       <w:pPr>
-        <w:spacing w:before="20" w:after="80"/>
+        <w:spacing w:before="20" w:after="40"/>
         <w:jc w:val="center"/>
       </w:pPr>
       <w:r>
         <w:rPr>
           <w:i/>
           <w:color w:val="282828"/>
-          <w:sz w:val="19"/>
+          <w:sz w:val="21"/>
         </w:rPr>
         <w:t>Figure 5.1: Live Rendered Output – Floating Glassmorphic Top Navigation Island with Rapid Section Anchors</w:t>
       </w:r>
@@ -1723,13 +1770,12 @@
     </w:p>
     <w:p>
       <w:pPr>
-        <w:spacing w:before="80" w:after="60"/>
+        <w:spacing w:before="40" w:after="40" w:line="300" w:lineRule="auto"/>
       </w:pPr>
       <w:r>
         <w:rPr>
           <w:b/>
           <w:color w:val="0F172A"/>
-          <w:sz w:val="23"/>
         </w:rPr>
         <w:lastRenderedPageBreak/>
         <w:t>5.2 Editorial Hero Presentation &amp; Textile Heritage Telemetry</w:t>
@@ -1743,7 +1789,7 @@
         <w:tblLook w:val="04A0" w:firstRow="1" w:lastRow="0" w:firstColumn="1" w:lastColumn="0" w:noHBand="0" w:noVBand="1"/>
       </w:tblPr>
       <w:tblGrid>
-        <w:gridCol w:w="9936"/>
+        <w:gridCol w:w="10080"/>
       </w:tblGrid>
       <w:tr>
         <w:trPr>
@@ -1751,7 +1797,7 @@
         </w:trPr>
         <w:tc>
           <w:tcPr>
-            <w:tcW w:w="9936" w:type="dxa"/>
+            <w:tcW w:w="10080" w:type="dxa"/>
             <w:tcBorders>
               <w:top w:val="single" w:sz="6" w:space="0" w:color="2B3545"/>
               <w:left w:val="single" w:sz="6" w:space="0" w:color="2B3545"/>
@@ -1760,15 +1806,15 @@
             </w:tcBorders>
             <w:shd w:val="clear" w:color="auto" w:fill="FBFBFD"/>
             <w:tcMar>
-              <w:top w:w="100" w:type="dxa"/>
-              <w:left w:w="140" w:type="dxa"/>
-              <w:bottom w:w="100" w:type="dxa"/>
-              <w:right w:w="140" w:type="dxa"/>
+              <w:top w:w="80" w:type="dxa"/>
+              <w:left w:w="120" w:type="dxa"/>
+              <w:bottom w:w="80" w:type="dxa"/>
+              <w:right w:w="120" w:type="dxa"/>
             </w:tcMar>
           </w:tcPr>
           <w:p>
             <w:pPr>
-              <w:spacing w:after="60" w:line="252" w:lineRule="auto"/>
+              <w:spacing w:after="40" w:line="252" w:lineRule="auto"/>
             </w:pPr>
             <w:r>
               <w:rPr>
@@ -1792,7 +1838,7 @@
               <w:rPr>
                 <w:rFonts w:ascii="Consolas" w:hAnsi="Consolas"/>
                 <w:color w:val="1E293B"/>
-                <w:sz w:val="16"/>
+                <w:sz w:val="15"/>
               </w:rPr>
               <w:t>&lt;!-- Editorial Hero Presentation &amp; Live Production Telemetry --&gt;</w:t>
             </w:r>
@@ -1800,7 +1846,7 @@
               <w:rPr>
                 <w:rFonts w:ascii="Consolas" w:hAnsi="Consolas"/>
                 <w:color w:val="1E293B"/>
-                <w:sz w:val="16"/>
+                <w:sz w:val="15"/>
               </w:rPr>
               <w:br/>
               <w:t>&lt;section class="hero-editorial"&gt;</w:t>
@@ -1809,7 +1855,7 @@
               <w:rPr>
                 <w:rFonts w:ascii="Consolas" w:hAnsi="Consolas"/>
                 <w:color w:val="1E293B"/>
-                <w:sz w:val="16"/>
+                <w:sz w:val="15"/>
               </w:rPr>
               <w:br/>
               <w:t xml:space="preserve">  &lt;div class="badge-origin"&gt;TIRUPPUR KNITWEAR CLUSTER • EST. 1994&lt;/div&gt;</w:t>
@@ -1818,7 +1864,7 @@
               <w:rPr>
                 <w:rFonts w:ascii="Consolas" w:hAnsi="Consolas"/>
                 <w:color w:val="1E293B"/>
-                <w:sz w:val="16"/>
+                <w:sz w:val="15"/>
               </w:rPr>
               <w:br/>
               <w:t xml:space="preserve">  &lt;h1 class="headline-garamond"&gt;Pure Combed Cotton. Timeless Innerwear Craft.&lt;/h1&gt;</w:t>
@@ -1827,7 +1873,7 @@
               <w:rPr>
                 <w:rFonts w:ascii="Consolas" w:hAnsi="Consolas"/>
                 <w:color w:val="1E293B"/>
-                <w:sz w:val="16"/>
+                <w:sz w:val="15"/>
               </w:rPr>
               <w:br/>
               <w:t xml:space="preserve">  &lt;p class="subtext-lead"&gt;Direct mill supply of premium 100% combed cotton intimates...&lt;/p&gt;</w:t>
@@ -1836,7 +1882,7 @@
               <w:rPr>
                 <w:rFonts w:ascii="Consolas" w:hAnsi="Consolas"/>
                 <w:color w:val="1E293B"/>
-                <w:sz w:val="16"/>
+                <w:sz w:val="15"/>
               </w:rPr>
               <w:br/>
               <w:t xml:space="preserve">  &lt;div class="telemetry-ribbon"&gt;</w:t>
@@ -1845,7 +1891,7 @@
               <w:rPr>
                 <w:rFonts w:ascii="Consolas" w:hAnsi="Consolas"/>
                 <w:color w:val="1E293B"/>
-                <w:sz w:val="16"/>
+                <w:sz w:val="15"/>
               </w:rPr>
               <w:br/>
             </w:r>
@@ -1853,7 +1899,7 @@
               <w:rPr>
                 <w:rFonts w:ascii="Consolas" w:hAnsi="Consolas"/>
                 <w:color w:val="1E293B"/>
-                <w:sz w:val="16"/>
+                <w:sz w:val="15"/>
               </w:rPr>
               <w:t xml:space="preserve">    &lt;div class="metric"&gt;&lt;span class="num"&gt;30+&lt;/span&gt;&lt;span class="lbl"&gt;Years Mastery&lt;/span&gt;&lt;/div&gt;</w:t>
             </w:r>
@@ -1861,7 +1907,7 @@
               <w:rPr>
                 <w:rFonts w:ascii="Consolas" w:hAnsi="Consolas"/>
                 <w:color w:val="1E293B"/>
-                <w:sz w:val="16"/>
+                <w:sz w:val="15"/>
               </w:rPr>
               <w:br/>
               <w:t xml:space="preserve">    &lt;div class="metric"&gt;&lt;span class="num"&gt;50,000+&lt;/span&gt;&lt;span class="lbl"&gt;Pcs / Day Capacity&lt;/span&gt;&lt;/div&gt;</w:t>
@@ -1870,7 +1916,7 @@
               <w:rPr>
                 <w:rFonts w:ascii="Consolas" w:hAnsi="Consolas"/>
                 <w:color w:val="1E293B"/>
-                <w:sz w:val="16"/>
+                <w:sz w:val="15"/>
               </w:rPr>
               <w:br/>
               <w:t xml:space="preserve">    &lt;div class="metric"&gt;&lt;span class="num"&gt;100%&lt;/span&gt;&lt;span class="lbl"&gt;Combed Shankar-6&lt;/span&gt;&lt;/div&gt;</w:t>
@@ -1879,7 +1925,7 @@
               <w:rPr>
                 <w:rFonts w:ascii="Consolas" w:hAnsi="Consolas"/>
                 <w:color w:val="1E293B"/>
-                <w:sz w:val="16"/>
+                <w:sz w:val="15"/>
               </w:rPr>
               <w:br/>
               <w:t xml:space="preserve">    &lt;div class="metric"&gt;&lt;span class="num"&gt;Zero&lt;/span&gt;&lt;span class="lbl"&gt;Shrinkage Guarantee&lt;/span&gt;&lt;/div&gt;</w:t>
@@ -1888,7 +1934,7 @@
               <w:rPr>
                 <w:rFonts w:ascii="Consolas" w:hAnsi="Consolas"/>
                 <w:color w:val="1E293B"/>
-                <w:sz w:val="16"/>
+                <w:sz w:val="15"/>
               </w:rPr>
               <w:br/>
               <w:t xml:space="preserve">  &lt;/div&gt;</w:t>
@@ -1897,7 +1943,7 @@
               <w:rPr>
                 <w:rFonts w:ascii="Consolas" w:hAnsi="Consolas"/>
                 <w:color w:val="1E293B"/>
-                <w:sz w:val="16"/>
+                <w:sz w:val="15"/>
               </w:rPr>
               <w:br/>
               <w:t>&lt;/section&gt;</w:t>
@@ -1913,28 +1959,28 @@
     </w:p>
     <w:p>
       <w:pPr>
-        <w:spacing w:before="60" w:after="80"/>
+        <w:spacing w:before="40" w:after="60"/>
         <w:jc w:val="both"/>
       </w:pPr>
       <w:r>
         <w:rPr>
           <w:b/>
           <w:i/>
-          <w:sz w:val="19"/>
+          <w:sz w:val="23"/>
         </w:rPr>
         <w:t xml:space="preserve">Technical Insight: </w:t>
       </w:r>
       <w:r>
         <w:rPr>
           <w:i/>
-          <w:sz w:val="19"/>
+          <w:sz w:val="23"/>
         </w:rPr>
         <w:t>Features an editorial layout with clean serif typography (Playfair/Cinzel + Inter), highlighting 30+ years of Tiruppur manufacturing mastery, 50,000+ daily piece capacity, and direct wholesale CTAs.</w:t>
       </w:r>
     </w:p>
     <w:p>
       <w:pPr>
-        <w:spacing w:before="80" w:after="60"/>
+        <w:spacing w:before="40" w:after="40"/>
         <w:jc w:val="center"/>
       </w:pPr>
       <w:r>
@@ -1942,8 +1988,8 @@
           <w:noProof/>
         </w:rPr>
         <w:drawing>
-          <wp:inline distT="0" distB="0" distL="0" distR="0" wp14:anchorId="304B32DC" wp14:editId="4FEAFC0F">
-            <wp:extent cx="4846320" cy="2544318"/>
+          <wp:inline distT="0" distB="0" distL="0" distR="0" wp14:anchorId="50348E83" wp14:editId="0B4C2AE8">
+            <wp:extent cx="4663440" cy="2448306"/>
             <wp:effectExtent l="0" t="0" r="0" b="0"/>
             <wp:docPr id="4" name="Picture 4"/>
             <wp:cNvGraphicFramePr>
@@ -1965,7 +2011,7 @@
                   <pic:spPr>
                     <a:xfrm>
                       <a:off x="0" y="0"/>
-                      <a:ext cx="4846320" cy="2544318"/>
+                      <a:ext cx="4663440" cy="2448306"/>
                     </a:xfrm>
                     <a:prstGeom prst="rect">
                       <a:avLst/>
@@ -1980,14 +2026,14 @@
     </w:p>
     <w:p>
       <w:pPr>
-        <w:spacing w:before="20" w:after="80"/>
+        <w:spacing w:before="20" w:after="40"/>
         <w:jc w:val="center"/>
       </w:pPr>
       <w:r>
         <w:rPr>
           <w:i/>
           <w:color w:val="282828"/>
-          <w:sz w:val="19"/>
+          <w:sz w:val="21"/>
         </w:rPr>
         <w:t>Figure 5.2: Live Rendered Output – Editorial Hero Section with Brand Heritage Telemetry Metrics</w:t>
       </w:r>
@@ -1999,13 +2045,12 @@
     </w:p>
     <w:p>
       <w:pPr>
-        <w:spacing w:before="80" w:after="60"/>
+        <w:spacing w:before="40" w:after="40" w:line="300" w:lineRule="auto"/>
       </w:pPr>
       <w:r>
         <w:rPr>
           <w:b/>
           <w:color w:val="0F172A"/>
-          <w:sz w:val="23"/>
         </w:rPr>
         <w:lastRenderedPageBreak/>
         <w:t>5.3 Pinned 100vh Viewport Scrollytelling Stage &amp; Crossfade Transitions</w:t>
@@ -2019,7 +2064,7 @@
         <w:tblLook w:val="04A0" w:firstRow="1" w:lastRow="0" w:firstColumn="1" w:lastColumn="0" w:noHBand="0" w:noVBand="1"/>
       </w:tblPr>
       <w:tblGrid>
-        <w:gridCol w:w="9936"/>
+        <w:gridCol w:w="10080"/>
       </w:tblGrid>
       <w:tr>
         <w:trPr>
@@ -2027,7 +2072,7 @@
         </w:trPr>
         <w:tc>
           <w:tcPr>
-            <w:tcW w:w="9936" w:type="dxa"/>
+            <w:tcW w:w="10080" w:type="dxa"/>
             <w:tcBorders>
               <w:top w:val="single" w:sz="6" w:space="0" w:color="2B3545"/>
               <w:left w:val="single" w:sz="6" w:space="0" w:color="2B3545"/>
@@ -2036,15 +2081,15 @@
             </w:tcBorders>
             <w:shd w:val="clear" w:color="auto" w:fill="FBFBFD"/>
             <w:tcMar>
-              <w:top w:w="100" w:type="dxa"/>
-              <w:left w:w="140" w:type="dxa"/>
-              <w:bottom w:w="100" w:type="dxa"/>
-              <w:right w:w="140" w:type="dxa"/>
+              <w:top w:w="80" w:type="dxa"/>
+              <w:left w:w="120" w:type="dxa"/>
+              <w:bottom w:w="80" w:type="dxa"/>
+              <w:right w:w="120" w:type="dxa"/>
             </w:tcMar>
           </w:tcPr>
           <w:p>
             <w:pPr>
-              <w:spacing w:after="60" w:line="252" w:lineRule="auto"/>
+              <w:spacing w:after="40" w:line="252" w:lineRule="auto"/>
             </w:pPr>
             <w:r>
               <w:rPr>
@@ -2069,7 +2114,7 @@
                 <w:rFonts w:ascii="Consolas" w:hAnsi="Consolas"/>
                 <w:i/>
                 <w:color w:val="5A6978"/>
-                <w:sz w:val="16"/>
+                <w:sz w:val="15"/>
               </w:rPr>
               <w:t>/* Pinned 100vh Scrollytelling Stage */</w:t>
             </w:r>
@@ -2078,7 +2123,7 @@
                 <w:rFonts w:ascii="Consolas" w:hAnsi="Consolas"/>
                 <w:i/>
                 <w:color w:val="5A6978"/>
-                <w:sz w:val="16"/>
+                <w:sz w:val="15"/>
               </w:rPr>
               <w:br/>
             </w:r>
@@ -2086,7 +2131,7 @@
               <w:rPr>
                 <w:rFonts w:ascii="Consolas" w:hAnsi="Consolas"/>
                 <w:color w:val="1E293B"/>
-                <w:sz w:val="16"/>
+                <w:sz w:val="15"/>
               </w:rPr>
               <w:t>.scrolly-container { position: relative; }</w:t>
             </w:r>
@@ -2094,7 +2139,7 @@
               <w:rPr>
                 <w:rFonts w:ascii="Consolas" w:hAnsi="Consolas"/>
                 <w:color w:val="1E293B"/>
-                <w:sz w:val="16"/>
+                <w:sz w:val="15"/>
               </w:rPr>
               <w:br/>
               <w:t>.scrolly-viewport {</w:t>
@@ -2103,34 +2148,61 @@
               <w:rPr>
                 <w:rFonts w:ascii="Consolas" w:hAnsi="Consolas"/>
                 <w:color w:val="1E293B"/>
-                <w:sz w:val="16"/>
+                <w:sz w:val="15"/>
               </w:rPr>
               <w:br/>
-              <w:t xml:space="preserve">  position: sticky; top: 0; height: 100vh;</w:t>
+              <w:t xml:space="preserve">  position: sticky; top: 0; height: 100vh; overflow: hidden;</w:t>
             </w:r>
             <w:r>
               <w:rPr>
                 <w:rFonts w:ascii="Consolas" w:hAnsi="Consolas"/>
                 <w:color w:val="1E293B"/>
-                <w:sz w:val="16"/>
+                <w:sz w:val="15"/>
               </w:rPr>
               <w:br/>
-              <w:t xml:space="preserve">  overflow: hidden; display: flex;</w:t>
+              <w:t xml:space="preserve">  display: flex; align-items: center; justify-content: center;</w:t>
             </w:r>
             <w:r>
               <w:rPr>
                 <w:rFonts w:ascii="Consolas" w:hAnsi="Consolas"/>
                 <w:color w:val="1E293B"/>
-                <w:sz w:val="16"/>
+                <w:sz w:val="15"/>
               </w:rPr>
               <w:br/>
-              <w:t xml:space="preserve">  align-items: center; justify-content: center;</w:t>
+              <w:t>}</w:t>
             </w:r>
             <w:r>
               <w:rPr>
                 <w:rFonts w:ascii="Consolas" w:hAnsi="Consolas"/>
                 <w:color w:val="1E293B"/>
-                <w:sz w:val="16"/>
+                <w:sz w:val="15"/>
+              </w:rPr>
+              <w:br/>
+              <w:t>.scrolly-slide {</w:t>
+            </w:r>
+            <w:r>
+              <w:rPr>
+                <w:rFonts w:ascii="Consolas" w:hAnsi="Consolas"/>
+                <w:color w:val="1E293B"/>
+                <w:sz w:val="15"/>
+              </w:rPr>
+              <w:br/>
+              <w:t xml:space="preserve">  position: absolute; inset: 0; opacity: 0; transform: scale(0.96) translateY(20px);</w:t>
+            </w:r>
+            <w:r>
+              <w:rPr>
+                <w:rFonts w:ascii="Consolas" w:hAnsi="Consolas"/>
+                <w:color w:val="1E293B"/>
+                <w:sz w:val="15"/>
+              </w:rPr>
+              <w:br/>
+              <w:t xml:space="preserve">  transition: opacity 0.8s ease, transform 0.8s ease;</w:t>
+            </w:r>
+            <w:r>
+              <w:rPr>
+                <w:rFonts w:ascii="Consolas" w:hAnsi="Consolas"/>
+                <w:color w:val="1E293B"/>
+                <w:sz w:val="15"/>
               </w:rPr>
               <w:br/>
               <w:t>}</w:t>
@@ -2139,73 +2211,10 @@
               <w:rPr>
                 <w:rFonts w:ascii="Consolas" w:hAnsi="Consolas"/>
                 <w:color w:val="1E293B"/>
-                <w:sz w:val="16"/>
+                <w:sz w:val="15"/>
               </w:rPr>
               <w:br/>
-              <w:t>.scrolly-slide {</w:t>
-            </w:r>
-            <w:r>
-              <w:rPr>
-                <w:rFonts w:ascii="Consolas" w:hAnsi="Consolas"/>
-                <w:color w:val="1E293B"/>
-                <w:sz w:val="16"/>
-              </w:rPr>
-              <w:br/>
-              <w:t xml:space="preserve">  position: absolute; inset: 0;</w:t>
-            </w:r>
-            <w:r>
-              <w:rPr>
-                <w:rFonts w:ascii="Consolas" w:hAnsi="Consolas"/>
-                <w:color w:val="1E293B"/>
-                <w:sz w:val="16"/>
-              </w:rPr>
-              <w:br/>
-              <w:t xml:space="preserve">  opacity: 0; transform: scale(0.96) translateY(20px);</w:t>
-            </w:r>
-            <w:r>
-              <w:rPr>
-                <w:rFonts w:ascii="Consolas" w:hAnsi="Consolas"/>
-                <w:color w:val="1E293B"/>
-                <w:sz w:val="16"/>
-              </w:rPr>
-              <w:br/>
-              <w:t xml:space="preserve">  transition: opacity 0.8s ease, transform 0.8s ease;</w:t>
-            </w:r>
-            <w:r>
-              <w:rPr>
-                <w:rFonts w:ascii="Consolas" w:hAnsi="Consolas"/>
-                <w:color w:val="1E293B"/>
-                <w:sz w:val="16"/>
-              </w:rPr>
-              <w:br/>
-              <w:t>}</w:t>
-            </w:r>
-            <w:r>
-              <w:rPr>
-                <w:rFonts w:ascii="Consolas" w:hAnsi="Consolas"/>
-                <w:color w:val="1E293B"/>
-                <w:sz w:val="16"/>
-              </w:rPr>
-              <w:br/>
-              <w:t>.scrolly-slide.active {</w:t>
-            </w:r>
-            <w:r>
-              <w:rPr>
-                <w:rFonts w:ascii="Consolas" w:hAnsi="Consolas"/>
-                <w:color w:val="1E293B"/>
-                <w:sz w:val="16"/>
-              </w:rPr>
-              <w:br/>
-              <w:t xml:space="preserve">  opacity: 1; transform: scale(1) translateY(0);</w:t>
-            </w:r>
-            <w:r>
-              <w:rPr>
-                <w:rFonts w:ascii="Consolas" w:hAnsi="Consolas"/>
-                <w:color w:val="1E293B"/>
-                <w:sz w:val="16"/>
-              </w:rPr>
-              <w:br/>
-              <w:t>}</w:t>
+              <w:t>.scrolly-slide.active { opacity: 1; transform: scale(1) translateY(0); }</w:t>
             </w:r>
           </w:p>
         </w:tc>
@@ -2218,28 +2227,28 @@
     </w:p>
     <w:p>
       <w:pPr>
-        <w:spacing w:before="60" w:after="80"/>
+        <w:spacing w:before="40" w:after="60"/>
         <w:jc w:val="both"/>
       </w:pPr>
       <w:r>
         <w:rPr>
           <w:b/>
           <w:i/>
-          <w:sz w:val="19"/>
+          <w:sz w:val="23"/>
         </w:rPr>
         <w:t xml:space="preserve">Technical Insight: </w:t>
       </w:r>
       <w:r>
         <w:rPr>
           <w:i/>
-          <w:sz w:val="19"/>
+          <w:sz w:val="23"/>
         </w:rPr>
         <w:t>Locks the visual canvas across the user's viewport while background macro-photography slides smoothly crossfade between cotton sourcing, spinning, circular knitting, and artisan finishing stages.</w:t>
       </w:r>
     </w:p>
     <w:p>
       <w:pPr>
-        <w:spacing w:before="80" w:after="60"/>
+        <w:spacing w:before="40" w:after="40"/>
         <w:jc w:val="center"/>
       </w:pPr>
       <w:r>
@@ -2247,8 +2256,8 @@
           <w:noProof/>
         </w:rPr>
         <w:drawing>
-          <wp:inline distT="0" distB="0" distL="0" distR="0" wp14:anchorId="04D4B900" wp14:editId="6FC9D78A">
-            <wp:extent cx="4846320" cy="2302002"/>
+          <wp:inline distT="0" distB="0" distL="0" distR="0" wp14:anchorId="0416CEAA" wp14:editId="7A031510">
+            <wp:extent cx="4663440" cy="2215134"/>
             <wp:effectExtent l="0" t="0" r="0" b="0"/>
             <wp:docPr id="5" name="Picture 5"/>
             <wp:cNvGraphicFramePr>
@@ -2270,7 +2279,7 @@
                   <pic:spPr>
                     <a:xfrm>
                       <a:off x="0" y="0"/>
-                      <a:ext cx="4846320" cy="2302002"/>
+                      <a:ext cx="4663440" cy="2215134"/>
                     </a:xfrm>
                     <a:prstGeom prst="rect">
                       <a:avLst/>
@@ -2285,14 +2294,14 @@
     </w:p>
     <w:p>
       <w:pPr>
-        <w:spacing w:before="20" w:after="80"/>
+        <w:spacing w:before="20" w:after="40"/>
         <w:jc w:val="center"/>
       </w:pPr>
       <w:r>
         <w:rPr>
           <w:i/>
           <w:color w:val="282828"/>
-          <w:sz w:val="19"/>
+          <w:sz w:val="21"/>
         </w:rPr>
         <w:t>Figure 5.3: Live Rendered Output – Pinned 100vh Viewport Scrollytelling Stage (Stage 01: Shankar-6 Cotton)</w:t>
       </w:r>
@@ -2304,13 +2313,12 @@
     </w:p>
     <w:p>
       <w:pPr>
-        <w:spacing w:before="80" w:after="60"/>
+        <w:spacing w:before="40" w:after="40" w:line="300" w:lineRule="auto"/>
       </w:pPr>
       <w:r>
         <w:rPr>
           <w:b/>
           <w:color w:val="0F172A"/>
-          <w:sz w:val="23"/>
         </w:rPr>
         <w:lastRenderedPageBreak/>
         <w:t>5.4 IntersectionObserver Narrative Step Controller</w:t>
@@ -2324,7 +2332,7 @@
         <w:tblLook w:val="04A0" w:firstRow="1" w:lastRow="0" w:firstColumn="1" w:lastColumn="0" w:noHBand="0" w:noVBand="1"/>
       </w:tblPr>
       <w:tblGrid>
-        <w:gridCol w:w="9936"/>
+        <w:gridCol w:w="10080"/>
       </w:tblGrid>
       <w:tr>
         <w:trPr>
@@ -2332,7 +2340,7 @@
         </w:trPr>
         <w:tc>
           <w:tcPr>
-            <w:tcW w:w="9936" w:type="dxa"/>
+            <w:tcW w:w="10080" w:type="dxa"/>
             <w:tcBorders>
               <w:top w:val="single" w:sz="6" w:space="0" w:color="2B3545"/>
               <w:left w:val="single" w:sz="6" w:space="0" w:color="2B3545"/>
@@ -2341,15 +2349,15 @@
             </w:tcBorders>
             <w:shd w:val="clear" w:color="auto" w:fill="FBFBFD"/>
             <w:tcMar>
-              <w:top w:w="100" w:type="dxa"/>
-              <w:left w:w="140" w:type="dxa"/>
-              <w:bottom w:w="100" w:type="dxa"/>
-              <w:right w:w="140" w:type="dxa"/>
+              <w:top w:w="80" w:type="dxa"/>
+              <w:left w:w="120" w:type="dxa"/>
+              <w:bottom w:w="80" w:type="dxa"/>
+              <w:right w:w="120" w:type="dxa"/>
             </w:tcMar>
           </w:tcPr>
           <w:p>
             <w:pPr>
-              <w:spacing w:after="60" w:line="252" w:lineRule="auto"/>
+              <w:spacing w:after="40" w:line="252" w:lineRule="auto"/>
             </w:pPr>
             <w:r>
               <w:rPr>
@@ -2374,7 +2382,7 @@
                 <w:rFonts w:ascii="Consolas" w:hAnsi="Consolas"/>
                 <w:i/>
                 <w:color w:val="5A6978"/>
-                <w:sz w:val="16"/>
+                <w:sz w:val="15"/>
               </w:rPr>
               <w:t>// IntersectionObserver Narrative Chapter Activation Controller</w:t>
             </w:r>
@@ -2383,7 +2391,7 @@
                 <w:rFonts w:ascii="Consolas" w:hAnsi="Consolas"/>
                 <w:i/>
                 <w:color w:val="5A6978"/>
-                <w:sz w:val="16"/>
+                <w:sz w:val="15"/>
               </w:rPr>
               <w:br/>
             </w:r>
@@ -2392,102 +2400,69 @@
                 <w:rFonts w:ascii="Consolas" w:hAnsi="Consolas"/>
                 <w:b/>
                 <w:color w:val="10326E"/>
-                <w:sz w:val="16"/>
-              </w:rPr>
-              <w:t>const observerOptions = {</w:t>
+                <w:sz w:val="15"/>
+              </w:rPr>
+              <w:t>const observerOptions = { root: null, rootMargin: '-30% 0px -30% 0px', threshold: 0.2 };</w:t>
             </w:r>
             <w:r>
               <w:rPr>
                 <w:rFonts w:ascii="Consolas" w:hAnsi="Consolas"/>
                 <w:b/>
                 <w:color w:val="10326E"/>
-                <w:sz w:val="16"/>
+                <w:sz w:val="15"/>
               </w:rPr>
               <w:br/>
-            </w:r>
-            <w:r>
-              <w:rPr>
-                <w:rFonts w:ascii="Consolas" w:hAnsi="Consolas"/>
-                <w:color w:val="1E293B"/>
-                <w:sz w:val="16"/>
-              </w:rPr>
-              <w:t xml:space="preserve">  root: null, rootMargin: '-30% 0px -30% 0px', threshold: 0.2</w:t>
-            </w:r>
-            <w:r>
-              <w:rPr>
-                <w:rFonts w:ascii="Consolas" w:hAnsi="Consolas"/>
-                <w:color w:val="1E293B"/>
-                <w:sz w:val="16"/>
-              </w:rPr>
-              <w:br/>
-              <w:t>};</w:t>
-            </w:r>
-            <w:r>
-              <w:rPr>
-                <w:rFonts w:ascii="Consolas" w:hAnsi="Consolas"/>
-                <w:color w:val="1E293B"/>
-                <w:sz w:val="16"/>
-              </w:rPr>
-              <w:br/>
+              <w:t>const scrollyObserver = new IntersectionObserver((entries) =&gt; {</w:t>
             </w:r>
             <w:r>
               <w:rPr>
                 <w:rFonts w:ascii="Consolas" w:hAnsi="Consolas"/>
                 <w:b/>
                 <w:color w:val="10326E"/>
-                <w:sz w:val="16"/>
-              </w:rPr>
-              <w:t>const scrollyObserver = new IntersectionObserver((entries) =&gt; {</w:t>
+                <w:sz w:val="15"/>
+              </w:rPr>
+              <w:br/>
+            </w:r>
+            <w:r>
+              <w:rPr>
+                <w:rFonts w:ascii="Consolas" w:hAnsi="Consolas"/>
+                <w:color w:val="1E293B"/>
+                <w:sz w:val="15"/>
+              </w:rPr>
+              <w:t xml:space="preserve">  entries.forEach(entry =&gt; {</w:t>
+            </w:r>
+            <w:r>
+              <w:rPr>
+                <w:rFonts w:ascii="Consolas" w:hAnsi="Consolas"/>
+                <w:color w:val="1E293B"/>
+                <w:sz w:val="15"/>
+              </w:rPr>
+              <w:br/>
+              <w:t xml:space="preserve">    if (entry.isIntersecting) {</w:t>
+            </w:r>
+            <w:r>
+              <w:rPr>
+                <w:rFonts w:ascii="Consolas" w:hAnsi="Consolas"/>
+                <w:color w:val="1E293B"/>
+                <w:sz w:val="15"/>
+              </w:rPr>
+              <w:br/>
             </w:r>
             <w:r>
               <w:rPr>
                 <w:rFonts w:ascii="Consolas" w:hAnsi="Consolas"/>
                 <w:b/>
                 <w:color w:val="10326E"/>
-                <w:sz w:val="16"/>
-              </w:rPr>
-              <w:br/>
-            </w:r>
-            <w:r>
-              <w:rPr>
-                <w:rFonts w:ascii="Consolas" w:hAnsi="Consolas"/>
-                <w:color w:val="1E293B"/>
-                <w:sz w:val="16"/>
-              </w:rPr>
-              <w:t xml:space="preserve">  entries.forEach(entry =&gt; {</w:t>
-            </w:r>
-            <w:r>
-              <w:rPr>
-                <w:rFonts w:ascii="Consolas" w:hAnsi="Consolas"/>
-                <w:color w:val="1E293B"/>
-                <w:sz w:val="16"/>
-              </w:rPr>
-              <w:br/>
-              <w:t xml:space="preserve">    if (entry.isIntersecting) {</w:t>
-            </w:r>
-            <w:r>
-              <w:rPr>
-                <w:rFonts w:ascii="Consolas" w:hAnsi="Consolas"/>
-                <w:color w:val="1E293B"/>
-                <w:sz w:val="16"/>
-              </w:rPr>
-              <w:br/>
+                <w:sz w:val="15"/>
+              </w:rPr>
+              <w:t xml:space="preserve">      const stepIndex = entry.target.dataset.step;</w:t>
             </w:r>
             <w:r>
               <w:rPr>
                 <w:rFonts w:ascii="Consolas" w:hAnsi="Consolas"/>
                 <w:b/>
                 <w:color w:val="10326E"/>
-                <w:sz w:val="16"/>
-              </w:rPr>
-              <w:t xml:space="preserve">      const stepIndex = entry.target.dataset.step;</w:t>
-            </w:r>
-            <w:r>
-              <w:rPr>
-                <w:rFonts w:ascii="Consolas" w:hAnsi="Consolas"/>
-                <w:b/>
-                <w:color w:val="10326E"/>
-                <w:sz w:val="16"/>
+                <w:sz w:val="15"/>
               </w:rPr>
               <w:br/>
             </w:r>
@@ -2495,7 +2470,7 @@
               <w:rPr>
                 <w:rFonts w:ascii="Consolas" w:hAnsi="Consolas"/>
                 <w:color w:val="1E293B"/>
-                <w:sz w:val="16"/>
+                <w:sz w:val="15"/>
               </w:rPr>
               <w:t xml:space="preserve">      document.querySelectorAll('.scrolly-slide').forEach(s =&gt; s.classList.remove('active'));</w:t>
             </w:r>
@@ -2503,7 +2478,7 @@
               <w:rPr>
                 <w:rFonts w:ascii="Consolas" w:hAnsi="Consolas"/>
                 <w:color w:val="1E293B"/>
-                <w:sz w:val="16"/>
+                <w:sz w:val="15"/>
               </w:rPr>
               <w:br/>
               <w:t xml:space="preserve">      document.querySelector(`.slide-step-${stepIndex}`)?.classList.add('active');</w:t>
@@ -2512,7 +2487,7 @@
               <w:rPr>
                 <w:rFonts w:ascii="Consolas" w:hAnsi="Consolas"/>
                 <w:color w:val="1E293B"/>
-                <w:sz w:val="16"/>
+                <w:sz w:val="15"/>
               </w:rPr>
               <w:br/>
             </w:r>
@@ -2520,7 +2495,7 @@
               <w:rPr>
                 <w:rFonts w:ascii="Consolas" w:hAnsi="Consolas"/>
                 <w:color w:val="1E293B"/>
-                <w:sz w:val="16"/>
+                <w:sz w:val="15"/>
               </w:rPr>
               <w:t xml:space="preserve">      document.querySelectorAll('.step-indicator').forEach(i =&gt; i.classList.remove('current'));</w:t>
             </w:r>
@@ -2528,7 +2503,7 @@
               <w:rPr>
                 <w:rFonts w:ascii="Consolas" w:hAnsi="Consolas"/>
                 <w:color w:val="1E293B"/>
-                <w:sz w:val="16"/>
+                <w:sz w:val="15"/>
               </w:rPr>
               <w:br/>
               <w:t xml:space="preserve">      document.querySelector(`.dot-${stepIndex}`)?.classList.add('current');</w:t>
@@ -2537,7 +2512,7 @@
               <w:rPr>
                 <w:rFonts w:ascii="Consolas" w:hAnsi="Consolas"/>
                 <w:color w:val="1E293B"/>
-                <w:sz w:val="16"/>
+                <w:sz w:val="15"/>
               </w:rPr>
               <w:br/>
               <w:t xml:space="preserve">    }</w:t>
@@ -2546,7 +2521,7 @@
               <w:rPr>
                 <w:rFonts w:ascii="Consolas" w:hAnsi="Consolas"/>
                 <w:color w:val="1E293B"/>
-                <w:sz w:val="16"/>
+                <w:sz w:val="15"/>
               </w:rPr>
               <w:br/>
               <w:t xml:space="preserve">  });</w:t>
@@ -2555,7 +2530,7 @@
               <w:rPr>
                 <w:rFonts w:ascii="Consolas" w:hAnsi="Consolas"/>
                 <w:color w:val="1E293B"/>
-                <w:sz w:val="16"/>
+                <w:sz w:val="15"/>
               </w:rPr>
               <w:br/>
               <w:t>}, observerOptions);</w:t>
@@ -2564,7 +2539,7 @@
               <w:rPr>
                 <w:rFonts w:ascii="Consolas" w:hAnsi="Consolas"/>
                 <w:color w:val="1E293B"/>
-                <w:sz w:val="16"/>
+                <w:sz w:val="15"/>
               </w:rPr>
               <w:br/>
               <w:t>document.querySelectorAll('.narrative-step').forEach(s =&gt; scrollyObserver.observe(s));</w:t>
@@ -2580,28 +2555,28 @@
     </w:p>
     <w:p>
       <w:pPr>
-        <w:spacing w:before="60" w:after="80"/>
+        <w:spacing w:before="40" w:after="60"/>
         <w:jc w:val="both"/>
       </w:pPr>
       <w:r>
         <w:rPr>
           <w:b/>
           <w:i/>
-          <w:sz w:val="19"/>
+          <w:sz w:val="23"/>
         </w:rPr>
         <w:t xml:space="preserve">Technical Insight: </w:t>
       </w:r>
       <w:r>
         <w:rPr>
           <w:i/>
-          <w:sz w:val="19"/>
+          <w:sz w:val="23"/>
         </w:rPr>
         <w:t>Utilizes an efficient, hardware-accelerated IntersectionObserver with negative root margins to trigger narrative chapter cards exactly when they cross the focal optical axis of the viewport.</w:t>
       </w:r>
     </w:p>
     <w:p>
       <w:pPr>
-        <w:spacing w:before="80" w:after="60"/>
+        <w:spacing w:before="40" w:after="40"/>
         <w:jc w:val="center"/>
       </w:pPr>
       <w:r>
@@ -2609,8 +2584,8 @@
           <w:noProof/>
         </w:rPr>
         <w:drawing>
-          <wp:inline distT="0" distB="0" distL="0" distR="0" wp14:anchorId="2D5EBF39" wp14:editId="26DAAB60">
-            <wp:extent cx="4846320" cy="2673553"/>
+          <wp:inline distT="0" distB="0" distL="0" distR="0" wp14:anchorId="634C07B0" wp14:editId="76CFD4F5">
+            <wp:extent cx="4663440" cy="2572664"/>
             <wp:effectExtent l="0" t="0" r="0" b="0"/>
             <wp:docPr id="6" name="Picture 6"/>
             <wp:cNvGraphicFramePr>
@@ -2632,7 +2607,7 @@
                   <pic:spPr>
                     <a:xfrm>
                       <a:off x="0" y="0"/>
-                      <a:ext cx="4846320" cy="2673553"/>
+                      <a:ext cx="4663440" cy="2572664"/>
                     </a:xfrm>
                     <a:prstGeom prst="rect">
                       <a:avLst/>
@@ -2647,14 +2622,14 @@
     </w:p>
     <w:p>
       <w:pPr>
-        <w:spacing w:before="20" w:after="80"/>
+        <w:spacing w:before="20" w:after="40"/>
         <w:jc w:val="center"/>
       </w:pPr>
       <w:r>
         <w:rPr>
           <w:i/>
           <w:color w:val="282828"/>
-          <w:sz w:val="19"/>
+          <w:sz w:val="21"/>
         </w:rPr>
         <w:t>Figure 5.4: Live Rendered Output – Narrative Chapter Card with Frosted Glassmorphism and Step Telemetry</w:t>
       </w:r>
@@ -2666,13 +2641,12 @@
     </w:p>
     <w:p>
       <w:pPr>
-        <w:spacing w:before="80" w:after="60"/>
+        <w:spacing w:before="40" w:after="40" w:line="300" w:lineRule="auto"/>
       </w:pPr>
       <w:r>
         <w:rPr>
           <w:b/>
           <w:color w:val="0F172A"/>
-          <w:sz w:val="23"/>
         </w:rPr>
         <w:lastRenderedPageBreak/>
         <w:t>5.5 Editorial Collections Lookbook &amp; Packaging-Free Studio Presentation</w:t>
@@ -2686,7 +2660,7 @@
         <w:tblLook w:val="04A0" w:firstRow="1" w:lastRow="0" w:firstColumn="1" w:lastColumn="0" w:noHBand="0" w:noVBand="1"/>
       </w:tblPr>
       <w:tblGrid>
-        <w:gridCol w:w="9936"/>
+        <w:gridCol w:w="10080"/>
       </w:tblGrid>
       <w:tr>
         <w:trPr>
@@ -2694,7 +2668,7 @@
         </w:trPr>
         <w:tc>
           <w:tcPr>
-            <w:tcW w:w="9936" w:type="dxa"/>
+            <w:tcW w:w="10080" w:type="dxa"/>
             <w:tcBorders>
               <w:top w:val="single" w:sz="6" w:space="0" w:color="2B3545"/>
               <w:left w:val="single" w:sz="6" w:space="0" w:color="2B3545"/>
@@ -2703,15 +2677,15 @@
             </w:tcBorders>
             <w:shd w:val="clear" w:color="auto" w:fill="FBFBFD"/>
             <w:tcMar>
-              <w:top w:w="100" w:type="dxa"/>
-              <w:left w:w="140" w:type="dxa"/>
-              <w:bottom w:w="100" w:type="dxa"/>
-              <w:right w:w="140" w:type="dxa"/>
+              <w:top w:w="80" w:type="dxa"/>
+              <w:left w:w="120" w:type="dxa"/>
+              <w:bottom w:w="80" w:type="dxa"/>
+              <w:right w:w="120" w:type="dxa"/>
             </w:tcMar>
           </w:tcPr>
           <w:p>
             <w:pPr>
-              <w:spacing w:after="60" w:line="252" w:lineRule="auto"/>
+              <w:spacing w:after="40" w:line="252" w:lineRule="auto"/>
             </w:pPr>
             <w:r>
               <w:rPr>
@@ -2736,7 +2710,7 @@
                 <w:rFonts w:ascii="Consolas" w:hAnsi="Consolas"/>
                 <w:i/>
                 <w:color w:val="5A6978"/>
-                <w:sz w:val="16"/>
+                <w:sz w:val="15"/>
               </w:rPr>
               <w:t>/* Editorial Collections Grid with Clean Minimalist Cards */</w:t>
             </w:r>
@@ -2745,7 +2719,7 @@
                 <w:rFonts w:ascii="Consolas" w:hAnsi="Consolas"/>
                 <w:i/>
                 <w:color w:val="5A6978"/>
-                <w:sz w:val="16"/>
+                <w:sz w:val="15"/>
               </w:rPr>
               <w:br/>
             </w:r>
@@ -2753,7 +2727,7 @@
               <w:rPr>
                 <w:rFonts w:ascii="Consolas" w:hAnsi="Consolas"/>
                 <w:color w:val="1E293B"/>
-                <w:sz w:val="16"/>
+                <w:sz w:val="15"/>
               </w:rPr>
               <w:t>.lookbook-grid {</w:t>
             </w:r>
@@ -2761,34 +2735,68 @@
               <w:rPr>
                 <w:rFonts w:ascii="Consolas" w:hAnsi="Consolas"/>
                 <w:color w:val="1E293B"/>
-                <w:sz w:val="16"/>
+                <w:sz w:val="15"/>
               </w:rPr>
               <w:br/>
-              <w:t xml:space="preserve">  display: grid;</w:t>
+              <w:t xml:space="preserve">  display: grid; grid-template-columns: repeat(auto-fill, minmax(280px, 1fr));</w:t>
             </w:r>
             <w:r>
               <w:rPr>
                 <w:rFonts w:ascii="Consolas" w:hAnsi="Consolas"/>
                 <w:color w:val="1E293B"/>
-                <w:sz w:val="16"/>
+                <w:sz w:val="15"/>
               </w:rPr>
               <w:br/>
-              <w:t xml:space="preserve">  grid-template-columns: repeat(auto-fill, minmax(280px, 1fr));</w:t>
+              <w:t xml:space="preserve">  gap: 2rem; padding: 2rem 0;</w:t>
             </w:r>
             <w:r>
               <w:rPr>
                 <w:rFonts w:ascii="Consolas" w:hAnsi="Consolas"/>
                 <w:color w:val="1E293B"/>
-                <w:sz w:val="16"/>
+                <w:sz w:val="15"/>
               </w:rPr>
               <w:br/>
-              <w:t xml:space="preserve">  gap: 2rem; padding: 2rem 0;</w:t>
+              <w:t>}</w:t>
             </w:r>
             <w:r>
               <w:rPr>
                 <w:rFonts w:ascii="Consolas" w:hAnsi="Consolas"/>
                 <w:color w:val="1E293B"/>
-                <w:sz w:val="16"/>
+                <w:sz w:val="15"/>
+              </w:rPr>
+              <w:br/>
+              <w:t>.lookbook-card {</w:t>
+            </w:r>
+            <w:r>
+              <w:rPr>
+                <w:rFonts w:ascii="Consolas" w:hAnsi="Consolas"/>
+                <w:color w:val="1E293B"/>
+                <w:sz w:val="15"/>
+              </w:rPr>
+              <w:br/>
+            </w:r>
+            <w:r>
+              <w:rPr>
+                <w:rFonts w:ascii="Consolas" w:hAnsi="Consolas"/>
+                <w:color w:val="1E293B"/>
+                <w:sz w:val="15"/>
+              </w:rPr>
+              <w:t xml:space="preserve">  background: #ffffff; border-radius: 12px; border: 1px solid rgba(0, 0, 0, 0.06);</w:t>
+            </w:r>
+            <w:r>
+              <w:rPr>
+                <w:rFonts w:ascii="Consolas" w:hAnsi="Consolas"/>
+                <w:color w:val="1E293B"/>
+                <w:sz w:val="15"/>
+              </w:rPr>
+              <w:br/>
+              <w:t xml:space="preserve">  overflow: hidden; transition: transform 0.35s ease, box-shadow 0.35s ease;</w:t>
+            </w:r>
+            <w:r>
+              <w:rPr>
+                <w:rFonts w:ascii="Consolas" w:hAnsi="Consolas"/>
+                <w:color w:val="1E293B"/>
+                <w:sz w:val="15"/>
               </w:rPr>
               <w:br/>
               <w:t>}</w:t>
@@ -2797,86 +2805,25 @@
               <w:rPr>
                 <w:rFonts w:ascii="Consolas" w:hAnsi="Consolas"/>
                 <w:color w:val="1E293B"/>
-                <w:sz w:val="16"/>
+                <w:sz w:val="15"/>
               </w:rPr>
               <w:br/>
-              <w:t>.lookbook-card {</w:t>
+              <w:t>.lookbook-card:hover {</w:t>
             </w:r>
             <w:r>
               <w:rPr>
                 <w:rFonts w:ascii="Consolas" w:hAnsi="Consolas"/>
                 <w:color w:val="1E293B"/>
-                <w:sz w:val="16"/>
+                <w:sz w:val="15"/>
               </w:rPr>
               <w:br/>
-              <w:t xml:space="preserve">  background: #ffffff; border-radius: 12px;</w:t>
+              <w:t xml:space="preserve">  transform: translateY(-8px); box-shadow: 0 20px 40px rgba(0, 0, 0, 0.08);</w:t>
             </w:r>
             <w:r>
               <w:rPr>
                 <w:rFonts w:ascii="Consolas" w:hAnsi="Consolas"/>
                 <w:color w:val="1E293B"/>
-                <w:sz w:val="16"/>
-              </w:rPr>
-              <w:br/>
-            </w:r>
-            <w:r>
-              <w:rPr>
-                <w:rFonts w:ascii="Consolas" w:hAnsi="Consolas"/>
-                <w:color w:val="1E293B"/>
-                <w:sz w:val="16"/>
-              </w:rPr>
-              <w:t xml:space="preserve">  border: 1px solid rgba(0, 0, 0, 0.06); overflow: hidden;</w:t>
-            </w:r>
-            <w:r>
-              <w:rPr>
-                <w:rFonts w:ascii="Consolas" w:hAnsi="Consolas"/>
-                <w:color w:val="1E293B"/>
-                <w:sz w:val="16"/>
-              </w:rPr>
-              <w:br/>
-              <w:t xml:space="preserve">  transition: transform 0.35s ease, box-shadow 0.35s ease;</w:t>
-            </w:r>
-            <w:r>
-              <w:rPr>
-                <w:rFonts w:ascii="Consolas" w:hAnsi="Consolas"/>
-                <w:color w:val="1E293B"/>
-                <w:sz w:val="16"/>
-              </w:rPr>
-              <w:br/>
-              <w:t>}</w:t>
-            </w:r>
-            <w:r>
-              <w:rPr>
-                <w:rFonts w:ascii="Consolas" w:hAnsi="Consolas"/>
-                <w:color w:val="1E293B"/>
-                <w:sz w:val="16"/>
-              </w:rPr>
-              <w:br/>
-              <w:t>.lookbook-card:hover {</w:t>
-            </w:r>
-            <w:r>
-              <w:rPr>
-                <w:rFonts w:ascii="Consolas" w:hAnsi="Consolas"/>
-                <w:color w:val="1E293B"/>
-                <w:sz w:val="16"/>
-              </w:rPr>
-              <w:br/>
-              <w:t xml:space="preserve">  transform: translateY(-8px);</w:t>
-            </w:r>
-            <w:r>
-              <w:rPr>
-                <w:rFonts w:ascii="Consolas" w:hAnsi="Consolas"/>
-                <w:color w:val="1E293B"/>
-                <w:sz w:val="16"/>
-              </w:rPr>
-              <w:br/>
-              <w:t xml:space="preserve">  box-shadow: 0 20px 40px rgba(0, 0, 0, 0.08);</w:t>
-            </w:r>
-            <w:r>
-              <w:rPr>
-                <w:rFonts w:ascii="Consolas" w:hAnsi="Consolas"/>
-                <w:color w:val="1E293B"/>
-                <w:sz w:val="16"/>
+                <w:sz w:val="15"/>
               </w:rPr>
               <w:br/>
               <w:t>}</w:t>
@@ -2892,28 +2839,28 @@
     </w:p>
     <w:p>
       <w:pPr>
-        <w:spacing w:before="60" w:after="80"/>
+        <w:spacing w:before="40" w:after="60"/>
         <w:jc w:val="both"/>
       </w:pPr>
       <w:r>
         <w:rPr>
           <w:b/>
           <w:i/>
-          <w:sz w:val="19"/>
+          <w:sz w:val="23"/>
         </w:rPr>
         <w:t xml:space="preserve">Technical Insight: </w:t>
       </w:r>
       <w:r>
         <w:rPr>
           <w:i/>
-          <w:sz w:val="19"/>
+          <w:sz w:val="23"/>
         </w:rPr>
         <w:t>Showcases flat-lay and studio photography of bloomer briefs, cycling shorts, and slips without misleading commercial packaging, giving B2B buyers pure visual fidelity of seams and fabric weight.</w:t>
       </w:r>
     </w:p>
     <w:p>
       <w:pPr>
-        <w:spacing w:before="80" w:after="60"/>
+        <w:spacing w:before="40" w:after="40"/>
         <w:jc w:val="center"/>
       </w:pPr>
       <w:r>
@@ -2921,8 +2868,8 @@
           <w:noProof/>
         </w:rPr>
         <w:drawing>
-          <wp:inline distT="0" distB="0" distL="0" distR="0" wp14:anchorId="2DED4829" wp14:editId="02F60EE9">
-            <wp:extent cx="4846320" cy="2673553"/>
+          <wp:inline distT="0" distB="0" distL="0" distR="0" wp14:anchorId="1E29BC08" wp14:editId="421F50A7">
+            <wp:extent cx="4663440" cy="2572664"/>
             <wp:effectExtent l="0" t="0" r="0" b="0"/>
             <wp:docPr id="7" name="Picture 7"/>
             <wp:cNvGraphicFramePr>
@@ -2944,7 +2891,7 @@
                   <pic:spPr>
                     <a:xfrm>
                       <a:off x="0" y="0"/>
-                      <a:ext cx="4846320" cy="2673553"/>
+                      <a:ext cx="4663440" cy="2572664"/>
                     </a:xfrm>
                     <a:prstGeom prst="rect">
                       <a:avLst/>
@@ -2959,14 +2906,14 @@
     </w:p>
     <w:p>
       <w:pPr>
-        <w:spacing w:before="20" w:after="80"/>
+        <w:spacing w:before="20" w:after="40"/>
         <w:jc w:val="center"/>
       </w:pPr>
       <w:r>
         <w:rPr>
           <w:i/>
           <w:color w:val="282828"/>
-          <w:sz w:val="19"/>
+          <w:sz w:val="21"/>
         </w:rPr>
         <w:t>Figure 5.5: Live Rendered Output – Editorial Collections Lookbook with Pure Studio Garment Photography</w:t>
       </w:r>
@@ -2978,13 +2925,12 @@
     </w:p>
     <w:p>
       <w:pPr>
-        <w:spacing w:before="80" w:after="60"/>
+        <w:spacing w:before="40" w:after="40" w:line="300" w:lineRule="auto"/>
       </w:pPr>
       <w:r>
         <w:rPr>
           <w:b/>
           <w:color w:val="0F172A"/>
-          <w:sz w:val="23"/>
         </w:rPr>
         <w:lastRenderedPageBreak/>
         <w:t>5.6 Interactive Mannequin Shade Palette Swatch Switcher</w:t>
@@ -2998,7 +2944,7 @@
         <w:tblLook w:val="04A0" w:firstRow="1" w:lastRow="0" w:firstColumn="1" w:lastColumn="0" w:noHBand="0" w:noVBand="1"/>
       </w:tblPr>
       <w:tblGrid>
-        <w:gridCol w:w="9936"/>
+        <w:gridCol w:w="10080"/>
       </w:tblGrid>
       <w:tr>
         <w:trPr>
@@ -3006,7 +2952,7 @@
         </w:trPr>
         <w:tc>
           <w:tcPr>
-            <w:tcW w:w="9936" w:type="dxa"/>
+            <w:tcW w:w="10080" w:type="dxa"/>
             <w:tcBorders>
               <w:top w:val="single" w:sz="6" w:space="0" w:color="2B3545"/>
               <w:left w:val="single" w:sz="6" w:space="0" w:color="2B3545"/>
@@ -3015,15 +2961,15 @@
             </w:tcBorders>
             <w:shd w:val="clear" w:color="auto" w:fill="FBFBFD"/>
             <w:tcMar>
-              <w:top w:w="100" w:type="dxa"/>
-              <w:left w:w="140" w:type="dxa"/>
-              <w:bottom w:w="100" w:type="dxa"/>
-              <w:right w:w="140" w:type="dxa"/>
+              <w:top w:w="80" w:type="dxa"/>
+              <w:left w:w="120" w:type="dxa"/>
+              <w:bottom w:w="80" w:type="dxa"/>
+              <w:right w:w="120" w:type="dxa"/>
             </w:tcMar>
           </w:tcPr>
           <w:p>
             <w:pPr>
-              <w:spacing w:after="60" w:line="252" w:lineRule="auto"/>
+              <w:spacing w:after="40" w:line="252" w:lineRule="auto"/>
             </w:pPr>
             <w:r>
               <w:rPr>
@@ -3048,7 +2994,7 @@
                 <w:rFonts w:ascii="Consolas" w:hAnsi="Consolas"/>
                 <w:i/>
                 <w:color w:val="5A6978"/>
-                <w:sz w:val="16"/>
+                <w:sz w:val="15"/>
               </w:rPr>
               <w:t>// Dynamic Shade Swatch Selection &amp; SVG Mannequin Color Binding</w:t>
             </w:r>
@@ -3057,7 +3003,7 @@
                 <w:rFonts w:ascii="Consolas" w:hAnsi="Consolas"/>
                 <w:i/>
                 <w:color w:val="5A6978"/>
-                <w:sz w:val="16"/>
+                <w:sz w:val="15"/>
               </w:rPr>
               <w:br/>
             </w:r>
@@ -3066,7 +3012,7 @@
                 <w:rFonts w:ascii="Consolas" w:hAnsi="Consolas"/>
                 <w:b/>
                 <w:color w:val="10326E"/>
-                <w:sz w:val="16"/>
+                <w:sz w:val="15"/>
               </w:rPr>
               <w:t>function initShadeSwatches() {</w:t>
             </w:r>
@@ -3075,7 +3021,7 @@
                 <w:rFonts w:ascii="Consolas" w:hAnsi="Consolas"/>
                 <w:b/>
                 <w:color w:val="10326E"/>
-                <w:sz w:val="16"/>
+                <w:sz w:val="15"/>
               </w:rPr>
               <w:br/>
               <w:t xml:space="preserve">  const swatches = document.querySelectorAll('.shade-swatch');</w:t>
@@ -3085,7 +3031,7 @@
                 <w:rFonts w:ascii="Consolas" w:hAnsi="Consolas"/>
                 <w:b/>
                 <w:color w:val="10326E"/>
-                <w:sz w:val="16"/>
+                <w:sz w:val="15"/>
               </w:rPr>
               <w:br/>
               <w:t xml:space="preserve">  const previewGraphic = document.getElementById('garment-vector-fill');</w:t>
@@ -3095,7 +3041,7 @@
                 <w:rFonts w:ascii="Consolas" w:hAnsi="Consolas"/>
                 <w:b/>
                 <w:color w:val="10326E"/>
-                <w:sz w:val="16"/>
+                <w:sz w:val="15"/>
               </w:rPr>
               <w:br/>
             </w:r>
@@ -3103,7 +3049,7 @@
               <w:rPr>
                 <w:rFonts w:ascii="Consolas" w:hAnsi="Consolas"/>
                 <w:color w:val="1E293B"/>
-                <w:sz w:val="16"/>
+                <w:sz w:val="15"/>
               </w:rPr>
               <w:t xml:space="preserve">  swatches.forEach(swatch =&gt; {</w:t>
             </w:r>
@@ -3111,7 +3057,7 @@
               <w:rPr>
                 <w:rFonts w:ascii="Consolas" w:hAnsi="Consolas"/>
                 <w:color w:val="1E293B"/>
-                <w:sz w:val="16"/>
+                <w:sz w:val="15"/>
               </w:rPr>
               <w:br/>
             </w:r>
@@ -3119,7 +3065,7 @@
               <w:rPr>
                 <w:rFonts w:ascii="Consolas" w:hAnsi="Consolas"/>
                 <w:color w:val="1E293B"/>
-                <w:sz w:val="16"/>
+                <w:sz w:val="15"/>
               </w:rPr>
               <w:t xml:space="preserve">    swatch.addEventListener('click', () =&gt; {</w:t>
             </w:r>
@@ -3127,7 +3073,7 @@
               <w:rPr>
                 <w:rFonts w:ascii="Consolas" w:hAnsi="Consolas"/>
                 <w:color w:val="1E293B"/>
-                <w:sz w:val="16"/>
+                <w:sz w:val="15"/>
               </w:rPr>
               <w:br/>
               <w:t xml:space="preserve">      swatches.forEach(s =&gt; s.classList.remove('active-swatch'));</w:t>
@@ -3136,7 +3082,7 @@
               <w:rPr>
                 <w:rFonts w:ascii="Consolas" w:hAnsi="Consolas"/>
                 <w:color w:val="1E293B"/>
-                <w:sz w:val="16"/>
+                <w:sz w:val="15"/>
               </w:rPr>
               <w:br/>
               <w:t xml:space="preserve">      swatch.classList.add('active-swatch');</w:t>
@@ -3145,7 +3091,7 @@
               <w:rPr>
                 <w:rFonts w:ascii="Consolas" w:hAnsi="Consolas"/>
                 <w:color w:val="1E293B"/>
-                <w:sz w:val="16"/>
+                <w:sz w:val="15"/>
               </w:rPr>
               <w:br/>
             </w:r>
@@ -3154,7 +3100,7 @@
                 <w:rFonts w:ascii="Consolas" w:hAnsi="Consolas"/>
                 <w:b/>
                 <w:color w:val="10326E"/>
-                <w:sz w:val="16"/>
+                <w:sz w:val="15"/>
               </w:rPr>
               <w:t xml:space="preserve">      const hex = swatch.dataset.colorHex;</w:t>
             </w:r>
@@ -3163,7 +3109,7 @@
                 <w:rFonts w:ascii="Consolas" w:hAnsi="Consolas"/>
                 <w:b/>
                 <w:color w:val="10326E"/>
-                <w:sz w:val="16"/>
+                <w:sz w:val="15"/>
               </w:rPr>
               <w:br/>
               <w:t xml:space="preserve">      const shadeName = swatch.dataset.shadeName;</w:t>
@@ -3173,7 +3119,7 @@
                 <w:rFonts w:ascii="Consolas" w:hAnsi="Consolas"/>
                 <w:b/>
                 <w:color w:val="10326E"/>
-                <w:sz w:val="16"/>
+                <w:sz w:val="15"/>
               </w:rPr>
               <w:br/>
             </w:r>
@@ -3181,7 +3127,7 @@
               <w:rPr>
                 <w:rFonts w:ascii="Consolas" w:hAnsi="Consolas"/>
                 <w:color w:val="1E293B"/>
-                <w:sz w:val="16"/>
+                <w:sz w:val="15"/>
               </w:rPr>
               <w:t xml:space="preserve">      if (previewGraphic) previewGraphic.style.fill = hex;</w:t>
             </w:r>
@@ -3189,7 +3135,7 @@
               <w:rPr>
                 <w:rFonts w:ascii="Consolas" w:hAnsi="Consolas"/>
                 <w:color w:val="1E293B"/>
-                <w:sz w:val="16"/>
+                <w:sz w:val="15"/>
               </w:rPr>
               <w:br/>
               <w:t xml:space="preserve">      document.getElementById('current-shade-label').textContent = shadeName;</w:t>
@@ -3198,7 +3144,7 @@
               <w:rPr>
                 <w:rFonts w:ascii="Consolas" w:hAnsi="Consolas"/>
                 <w:color w:val="1E293B"/>
-                <w:sz w:val="16"/>
+                <w:sz w:val="15"/>
               </w:rPr>
               <w:br/>
               <w:t xml:space="preserve">    });</w:t>
@@ -3207,7 +3153,7 @@
               <w:rPr>
                 <w:rFonts w:ascii="Consolas" w:hAnsi="Consolas"/>
                 <w:color w:val="1E293B"/>
-                <w:sz w:val="16"/>
+                <w:sz w:val="15"/>
               </w:rPr>
               <w:br/>
               <w:t xml:space="preserve">  });</w:t>
@@ -3216,7 +3162,7 @@
               <w:rPr>
                 <w:rFonts w:ascii="Consolas" w:hAnsi="Consolas"/>
                 <w:color w:val="1E293B"/>
-                <w:sz w:val="16"/>
+                <w:sz w:val="15"/>
               </w:rPr>
               <w:br/>
               <w:t>}</w:t>
@@ -3232,28 +3178,28 @@
     </w:p>
     <w:p>
       <w:pPr>
-        <w:spacing w:before="60" w:after="80"/>
+        <w:spacing w:before="40" w:after="60"/>
         <w:jc w:val="both"/>
       </w:pPr>
       <w:r>
         <w:rPr>
           <w:b/>
           <w:i/>
-          <w:sz w:val="19"/>
+          <w:sz w:val="23"/>
         </w:rPr>
         <w:t xml:space="preserve">Technical Insight: </w:t>
       </w:r>
       <w:r>
         <w:rPr>
           <w:i/>
-          <w:sz w:val="19"/>
+          <w:sz w:val="23"/>
         </w:rPr>
         <w:t>Allows wholesale buyers to audition seasonal shade assortments (Ruby Wine, Jet Black, Milk White, Forest Olive, Slate Grey) with live DOM color property mutation on vector garment silhouettes.</w:t>
       </w:r>
     </w:p>
     <w:p>
       <w:pPr>
-        <w:spacing w:before="80" w:after="60"/>
+        <w:spacing w:before="40" w:after="40"/>
         <w:jc w:val="center"/>
       </w:pPr>
       <w:r>
@@ -3261,8 +3207,8 @@
           <w:noProof/>
         </w:rPr>
         <w:drawing>
-          <wp:inline distT="0" distB="0" distL="0" distR="0" wp14:anchorId="34A6B518" wp14:editId="7A7E3940">
-            <wp:extent cx="4846320" cy="2673553"/>
+          <wp:inline distT="0" distB="0" distL="0" distR="0" wp14:anchorId="4665F707" wp14:editId="50C291A5">
+            <wp:extent cx="4663440" cy="2572664"/>
             <wp:effectExtent l="0" t="0" r="0" b="0"/>
             <wp:docPr id="8" name="Picture 8"/>
             <wp:cNvGraphicFramePr>
@@ -3284,7 +3230,7 @@
                   <pic:spPr>
                     <a:xfrm>
                       <a:off x="0" y="0"/>
-                      <a:ext cx="4846320" cy="2673553"/>
+                      <a:ext cx="4663440" cy="2572664"/>
                     </a:xfrm>
                     <a:prstGeom prst="rect">
                       <a:avLst/>
@@ -3299,14 +3245,14 @@
     </w:p>
     <w:p>
       <w:pPr>
-        <w:spacing w:before="20" w:after="80"/>
+        <w:spacing w:before="20" w:after="40"/>
         <w:jc w:val="center"/>
       </w:pPr>
       <w:r>
         <w:rPr>
           <w:i/>
           <w:color w:val="282828"/>
-          <w:sz w:val="19"/>
+          <w:sz w:val="21"/>
         </w:rPr>
         <w:t>Figure 5.6: Live Rendered Output – Interactive Shade Palette Swatches with Real-Time Vector Preview</w:t>
       </w:r>
@@ -3318,13 +3264,12 @@
     </w:p>
     <w:p>
       <w:pPr>
-        <w:spacing w:before="80" w:after="60"/>
+        <w:spacing w:before="40" w:after="40" w:line="300" w:lineRule="auto"/>
       </w:pPr>
       <w:r>
         <w:rPr>
           <w:b/>
           <w:color w:val="0F172A"/>
-          <w:sz w:val="23"/>
         </w:rPr>
         <w:lastRenderedPageBreak/>
         <w:t>5.7 Inclusive Textile Sizing Specification Modal</w:t>
@@ -3338,7 +3283,7 @@
         <w:tblLook w:val="04A0" w:firstRow="1" w:lastRow="0" w:firstColumn="1" w:lastColumn="0" w:noHBand="0" w:noVBand="1"/>
       </w:tblPr>
       <w:tblGrid>
-        <w:gridCol w:w="9936"/>
+        <w:gridCol w:w="10080"/>
       </w:tblGrid>
       <w:tr>
         <w:trPr>
@@ -3346,7 +3291,7 @@
         </w:trPr>
         <w:tc>
           <w:tcPr>
-            <w:tcW w:w="9936" w:type="dxa"/>
+            <w:tcW w:w="10080" w:type="dxa"/>
             <w:tcBorders>
               <w:top w:val="single" w:sz="6" w:space="0" w:color="2B3545"/>
               <w:left w:val="single" w:sz="6" w:space="0" w:color="2B3545"/>
@@ -3355,15 +3300,15 @@
             </w:tcBorders>
             <w:shd w:val="clear" w:color="auto" w:fill="FBFBFD"/>
             <w:tcMar>
-              <w:top w:w="100" w:type="dxa"/>
-              <w:left w:w="140" w:type="dxa"/>
-              <w:bottom w:w="100" w:type="dxa"/>
-              <w:right w:w="140" w:type="dxa"/>
+              <w:top w:w="80" w:type="dxa"/>
+              <w:left w:w="120" w:type="dxa"/>
+              <w:bottom w:w="80" w:type="dxa"/>
+              <w:right w:w="120" w:type="dxa"/>
             </w:tcMar>
           </w:tcPr>
           <w:p>
             <w:pPr>
-              <w:spacing w:after="60" w:line="252" w:lineRule="auto"/>
+              <w:spacing w:after="40" w:line="252" w:lineRule="auto"/>
             </w:pPr>
             <w:r>
               <w:rPr>
@@ -3388,7 +3333,7 @@
                 <w:rFonts w:ascii="Consolas" w:hAnsi="Consolas"/>
                 <w:i/>
                 <w:color w:val="5A6978"/>
-                <w:sz w:val="16"/>
+                <w:sz w:val="15"/>
               </w:rPr>
               <w:t>/* Inclusive Sizing Modal &amp; High-Legibility Specification Table */</w:t>
             </w:r>
@@ -3397,7 +3342,7 @@
                 <w:rFonts w:ascii="Consolas" w:hAnsi="Consolas"/>
                 <w:i/>
                 <w:color w:val="5A6978"/>
-                <w:sz w:val="16"/>
+                <w:sz w:val="15"/>
               </w:rPr>
               <w:br/>
             </w:r>
@@ -3405,7 +3350,7 @@
               <w:rPr>
                 <w:rFonts w:ascii="Consolas" w:hAnsi="Consolas"/>
                 <w:color w:val="1E293B"/>
-                <w:sz w:val="16"/>
+                <w:sz w:val="15"/>
               </w:rPr>
               <w:t>.modal-overlay {</w:t>
             </w:r>
@@ -3413,7 +3358,7 @@
               <w:rPr>
                 <w:rFonts w:ascii="Consolas" w:hAnsi="Consolas"/>
                 <w:color w:val="1E293B"/>
-                <w:sz w:val="16"/>
+                <w:sz w:val="15"/>
               </w:rPr>
               <w:br/>
             </w:r>
@@ -3421,78 +3366,69 @@
               <w:rPr>
                 <w:rFonts w:ascii="Consolas" w:hAnsi="Consolas"/>
                 <w:color w:val="1E293B"/>
-                <w:sz w:val="16"/>
-              </w:rPr>
-              <w:t xml:space="preserve">  position: fixed; inset: 0;</w:t>
+                <w:sz w:val="15"/>
+              </w:rPr>
+              <w:t xml:space="preserve">  position: fixed; inset: 0; background: rgba(15, 23, 42, 0.6);</w:t>
             </w:r>
             <w:r>
               <w:rPr>
                 <w:rFonts w:ascii="Consolas" w:hAnsi="Consolas"/>
                 <w:color w:val="1E293B"/>
-                <w:sz w:val="16"/>
+                <w:sz w:val="15"/>
               </w:rPr>
               <w:br/>
-              <w:t xml:space="preserve">  background: rgba(15, 23, 42, 0.6); backdrop-filter: blur(8px);</w:t>
+              <w:t xml:space="preserve">  backdrop-filter: blur(8px); display: flex; align-items: center; justify-content: center;</w:t>
             </w:r>
             <w:r>
               <w:rPr>
                 <w:rFonts w:ascii="Consolas" w:hAnsi="Consolas"/>
                 <w:color w:val="1E293B"/>
-                <w:sz w:val="16"/>
+                <w:sz w:val="15"/>
               </w:rPr>
               <w:br/>
-              <w:t xml:space="preserve">  display: flex; align-items: center; justify-content: center;</w:t>
+              <w:t xml:space="preserve">  opacity: 0; pointer-events: none; transition: opacity 0.3s ease;</w:t>
             </w:r>
             <w:r>
               <w:rPr>
                 <w:rFonts w:ascii="Consolas" w:hAnsi="Consolas"/>
                 <w:color w:val="1E293B"/>
-                <w:sz w:val="16"/>
+                <w:sz w:val="15"/>
               </w:rPr>
               <w:br/>
-              <w:t xml:space="preserve">  opacity: 0; pointer-events: none; transition: opacity 0.3s ease;</w:t>
+              <w:t>}</w:t>
             </w:r>
             <w:r>
               <w:rPr>
                 <w:rFonts w:ascii="Consolas" w:hAnsi="Consolas"/>
                 <w:color w:val="1E293B"/>
-                <w:sz w:val="16"/>
+                <w:sz w:val="15"/>
               </w:rPr>
               <w:br/>
-              <w:t>}</w:t>
+              <w:t>.modal-overlay.open { opacity: 1; pointer-events: auto; }</w:t>
             </w:r>
             <w:r>
               <w:rPr>
                 <w:rFonts w:ascii="Consolas" w:hAnsi="Consolas"/>
                 <w:color w:val="1E293B"/>
-                <w:sz w:val="16"/>
+                <w:sz w:val="15"/>
               </w:rPr>
               <w:br/>
-              <w:t>.modal-overlay.open { opacity: 1; pointer-events: auto; }</w:t>
+              <w:t>.sizing-table th { background: #1E293B; color: #fff; padding: 0.75rem 1rem; }</w:t>
             </w:r>
             <w:r>
               <w:rPr>
                 <w:rFonts w:ascii="Consolas" w:hAnsi="Consolas"/>
                 <w:color w:val="1E293B"/>
-                <w:sz w:val="16"/>
+                <w:sz w:val="15"/>
               </w:rPr>
               <w:br/>
-              <w:t>.sizing-table th { background: #1E293B; color: #fff; padding: 0.75rem 1rem; }</w:t>
+              <w:t>.sizing-table td { padding: 0.75rem 1rem; border-bottom: 1px solid #E2E8F0; }</w:t>
             </w:r>
             <w:r>
               <w:rPr>
                 <w:rFonts w:ascii="Consolas" w:hAnsi="Consolas"/>
                 <w:color w:val="1E293B"/>
-                <w:sz w:val="16"/>
-              </w:rPr>
-              <w:br/>
-              <w:t>.sizing-table td { padding: 0.75rem 1rem; border-bottom: 1px solid #E2E8F0; }</w:t>
-            </w:r>
-            <w:r>
-              <w:rPr>
-                <w:rFonts w:ascii="Consolas" w:hAnsi="Consolas"/>
-                <w:color w:val="1E293B"/>
-                <w:sz w:val="16"/>
+                <w:sz w:val="15"/>
               </w:rPr>
               <w:br/>
             </w:r>
@@ -3501,7 +3437,7 @@
                 <w:rFonts w:ascii="Consolas" w:hAnsi="Consolas"/>
                 <w:b/>
                 <w:color w:val="10326E"/>
-                <w:sz w:val="16"/>
+                <w:sz w:val="15"/>
               </w:rPr>
               <w:t>window.toggleSizingModal = function(show) {</w:t>
             </w:r>
@@ -3510,7 +3446,7 @@
                 <w:rFonts w:ascii="Consolas" w:hAnsi="Consolas"/>
                 <w:b/>
                 <w:color w:val="10326E"/>
-                <w:sz w:val="16"/>
+                <w:sz w:val="15"/>
               </w:rPr>
               <w:br/>
             </w:r>
@@ -3518,7 +3454,7 @@
               <w:rPr>
                 <w:rFonts w:ascii="Consolas" w:hAnsi="Consolas"/>
                 <w:color w:val="1E293B"/>
-                <w:sz w:val="16"/>
+                <w:sz w:val="15"/>
               </w:rPr>
               <w:t xml:space="preserve">  document.getElementById('size-modal').classList.toggle('open', show);</w:t>
             </w:r>
@@ -3526,7 +3462,7 @@
               <w:rPr>
                 <w:rFonts w:ascii="Consolas" w:hAnsi="Consolas"/>
                 <w:color w:val="1E293B"/>
-                <w:sz w:val="16"/>
+                <w:sz w:val="15"/>
               </w:rPr>
               <w:br/>
               <w:t>};</w:t>
@@ -3542,28 +3478,28 @@
     </w:p>
     <w:p>
       <w:pPr>
-        <w:spacing w:before="60" w:after="80"/>
+        <w:spacing w:before="40" w:after="60"/>
         <w:jc w:val="both"/>
       </w:pPr>
       <w:r>
         <w:rPr>
           <w:b/>
           <w:i/>
-          <w:sz w:val="19"/>
+          <w:sz w:val="23"/>
         </w:rPr>
         <w:t xml:space="preserve">Technical Insight: </w:t>
       </w:r>
       <w:r>
         <w:rPr>
           <w:i/>
-          <w:sz w:val="19"/>
+          <w:sz w:val="23"/>
         </w:rPr>
         <w:t>Provides complete measurement specifications across 11 distinct sizing tiers, from pediatric bloomers (45–75cm waist) to adult extended profiles (S–6XL), preventing costly bulk procurement ordering errors.</w:t>
       </w:r>
     </w:p>
     <w:p>
       <w:pPr>
-        <w:spacing w:before="80" w:after="60"/>
+        <w:spacing w:before="40" w:after="40"/>
         <w:jc w:val="center"/>
       </w:pPr>
       <w:r>
@@ -3571,8 +3507,8 @@
           <w:noProof/>
         </w:rPr>
         <w:drawing>
-          <wp:inline distT="0" distB="0" distL="0" distR="0" wp14:anchorId="576753CB" wp14:editId="32068337">
-            <wp:extent cx="4846320" cy="2302002"/>
+          <wp:inline distT="0" distB="0" distL="0" distR="0" wp14:anchorId="535A596E" wp14:editId="4C25BFC8">
+            <wp:extent cx="4663440" cy="2215134"/>
             <wp:effectExtent l="0" t="0" r="0" b="0"/>
             <wp:docPr id="9" name="Picture 9"/>
             <wp:cNvGraphicFramePr>
@@ -3594,7 +3530,7 @@
                   <pic:spPr>
                     <a:xfrm>
                       <a:off x="0" y="0"/>
-                      <a:ext cx="4846320" cy="2302002"/>
+                      <a:ext cx="4663440" cy="2215134"/>
                     </a:xfrm>
                     <a:prstGeom prst="rect">
                       <a:avLst/>
@@ -3609,14 +3545,14 @@
     </w:p>
     <w:p>
       <w:pPr>
-        <w:spacing w:before="20" w:after="80"/>
+        <w:spacing w:before="20" w:after="40"/>
         <w:jc w:val="center"/>
       </w:pPr>
       <w:r>
         <w:rPr>
           <w:i/>
           <w:color w:val="282828"/>
-          <w:sz w:val="19"/>
+          <w:sz w:val="21"/>
         </w:rPr>
         <w:t>Figure 5.7: Live Rendered Output – Inclusive Sizing Modal with Mill Measurement Grids (Kids 45-75 to Ladies S-6XL)</w:t>
       </w:r>
@@ -3628,13 +3564,12 @@
     </w:p>
     <w:p>
       <w:pPr>
-        <w:spacing w:before="80" w:after="60"/>
+        <w:spacing w:before="40" w:after="40" w:line="300" w:lineRule="auto"/>
       </w:pPr>
       <w:r>
         <w:rPr>
           <w:b/>
           <w:color w:val="0F172A"/>
-          <w:sz w:val="23"/>
         </w:rPr>
         <w:lastRenderedPageBreak/>
         <w:t>5.8 Tiruppur Mill &amp; Production Infrastructure Photo Essay</w:t>
@@ -3648,7 +3583,7 @@
         <w:tblLook w:val="04A0" w:firstRow="1" w:lastRow="0" w:firstColumn="1" w:lastColumn="0" w:noHBand="0" w:noVBand="1"/>
       </w:tblPr>
       <w:tblGrid>
-        <w:gridCol w:w="9936"/>
+        <w:gridCol w:w="10080"/>
       </w:tblGrid>
       <w:tr>
         <w:trPr>
@@ -3656,7 +3591,7 @@
         </w:trPr>
         <w:tc>
           <w:tcPr>
-            <w:tcW w:w="9936" w:type="dxa"/>
+            <w:tcW w:w="10080" w:type="dxa"/>
             <w:tcBorders>
               <w:top w:val="single" w:sz="6" w:space="0" w:color="2B3545"/>
               <w:left w:val="single" w:sz="6" w:space="0" w:color="2B3545"/>
@@ -3665,15 +3600,15 @@
             </w:tcBorders>
             <w:shd w:val="clear" w:color="auto" w:fill="FBFBFD"/>
             <w:tcMar>
-              <w:top w:w="100" w:type="dxa"/>
-              <w:left w:w="140" w:type="dxa"/>
-              <w:bottom w:w="100" w:type="dxa"/>
-              <w:right w:w="140" w:type="dxa"/>
+              <w:top w:w="80" w:type="dxa"/>
+              <w:left w:w="120" w:type="dxa"/>
+              <w:bottom w:w="80" w:type="dxa"/>
+              <w:right w:w="120" w:type="dxa"/>
             </w:tcMar>
           </w:tcPr>
           <w:p>
             <w:pPr>
-              <w:spacing w:after="60" w:line="252" w:lineRule="auto"/>
+              <w:spacing w:after="40" w:line="252" w:lineRule="auto"/>
             </w:pPr>
             <w:r>
               <w:rPr>
@@ -3698,7 +3633,7 @@
                 <w:rFonts w:ascii="Consolas" w:hAnsi="Consolas"/>
                 <w:i/>
                 <w:color w:val="5A6978"/>
-                <w:sz w:val="16"/>
+                <w:sz w:val="15"/>
               </w:rPr>
               <w:t>/* High-Impact Manufacturing Facility Visual Essay */</w:t>
             </w:r>
@@ -3707,7 +3642,7 @@
                 <w:rFonts w:ascii="Consolas" w:hAnsi="Consolas"/>
                 <w:i/>
                 <w:color w:val="5A6978"/>
-                <w:sz w:val="16"/>
+                <w:sz w:val="15"/>
               </w:rPr>
               <w:br/>
             </w:r>
@@ -3715,7 +3650,7 @@
               <w:rPr>
                 <w:rFonts w:ascii="Consolas" w:hAnsi="Consolas"/>
                 <w:color w:val="1E293B"/>
-                <w:sz w:val="16"/>
+                <w:sz w:val="15"/>
               </w:rPr>
               <w:t>.facility-gallery {</w:t>
             </w:r>
@@ -3723,25 +3658,52 @@
               <w:rPr>
                 <w:rFonts w:ascii="Consolas" w:hAnsi="Consolas"/>
                 <w:color w:val="1E293B"/>
-                <w:sz w:val="16"/>
+                <w:sz w:val="15"/>
               </w:rPr>
               <w:br/>
-              <w:t xml:space="preserve">  display: grid; grid-template-columns: repeat(3, 1fr);</w:t>
+              <w:t xml:space="preserve">  display: grid; grid-template-columns: repeat(3, 1fr); gap: 1.5rem; margin-top: 1.5rem;</w:t>
             </w:r>
             <w:r>
               <w:rPr>
                 <w:rFonts w:ascii="Consolas" w:hAnsi="Consolas"/>
                 <w:color w:val="1E293B"/>
-                <w:sz w:val="16"/>
+                <w:sz w:val="15"/>
               </w:rPr>
               <w:br/>
-              <w:t xml:space="preserve">  gap: 1.5rem; margin-top: 1.5rem;</w:t>
+              <w:t>}</w:t>
             </w:r>
             <w:r>
               <w:rPr>
                 <w:rFonts w:ascii="Consolas" w:hAnsi="Consolas"/>
                 <w:color w:val="1E293B"/>
-                <w:sz w:val="16"/>
+                <w:sz w:val="15"/>
+              </w:rPr>
+              <w:br/>
+              <w:t>.facility-item {</w:t>
+            </w:r>
+            <w:r>
+              <w:rPr>
+                <w:rFonts w:ascii="Consolas" w:hAnsi="Consolas"/>
+                <w:color w:val="1E293B"/>
+                <w:sz w:val="15"/>
+              </w:rPr>
+              <w:br/>
+              <w:t xml:space="preserve">  position: relative; border-radius: 8px; overflow: hidden;</w:t>
+            </w:r>
+            <w:r>
+              <w:rPr>
+                <w:rFonts w:ascii="Consolas" w:hAnsi="Consolas"/>
+                <w:color w:val="1E293B"/>
+                <w:sz w:val="15"/>
+              </w:rPr>
+              <w:br/>
+              <w:t xml:space="preserve">  aspect-ratio: 4 / 3; box-shadow: 0 4px 12px rgba(0, 0, 0, 0.08);</w:t>
+            </w:r>
+            <w:r>
+              <w:rPr>
+                <w:rFonts w:ascii="Consolas" w:hAnsi="Consolas"/>
+                <w:color w:val="1E293B"/>
+                <w:sz w:val="15"/>
               </w:rPr>
               <w:br/>
               <w:t>}</w:t>
@@ -3750,96 +3712,42 @@
               <w:rPr>
                 <w:rFonts w:ascii="Consolas" w:hAnsi="Consolas"/>
                 <w:color w:val="1E293B"/>
-                <w:sz w:val="16"/>
+                <w:sz w:val="15"/>
               </w:rPr>
               <w:br/>
-              <w:t>.facility-item {</w:t>
+              <w:t>.facility-item img {</w:t>
             </w:r>
             <w:r>
               <w:rPr>
                 <w:rFonts w:ascii="Consolas" w:hAnsi="Consolas"/>
                 <w:color w:val="1E293B"/>
-                <w:sz w:val="16"/>
+                <w:sz w:val="15"/>
               </w:rPr>
               <w:br/>
-              <w:t xml:space="preserve">  position: relative; border-radius: 8px;</w:t>
+              <w:t xml:space="preserve">  width: 100%; height: 100%; object-fit: cover; transition: transform 0.5s ease;</w:t>
             </w:r>
             <w:r>
               <w:rPr>
                 <w:rFonts w:ascii="Consolas" w:hAnsi="Consolas"/>
                 <w:color w:val="1E293B"/>
-                <w:sz w:val="16"/>
+                <w:sz w:val="15"/>
               </w:rPr>
               <w:br/>
-              <w:t xml:space="preserve">  overflow: hidden; aspect-ratio: 4 / 3;</w:t>
+              <w:t>}</w:t>
             </w:r>
             <w:r>
               <w:rPr>
                 <w:rFonts w:ascii="Consolas" w:hAnsi="Consolas"/>
                 <w:color w:val="1E293B"/>
-                <w:sz w:val="16"/>
+                <w:sz w:val="15"/>
               </w:rPr>
               <w:br/>
-              <w:t xml:space="preserve">  box-shadow: 0 4px 12px rgba(0, 0, 0, 0.08);</w:t>
             </w:r>
             <w:r>
               <w:rPr>
                 <w:rFonts w:ascii="Consolas" w:hAnsi="Consolas"/>
                 <w:color w:val="1E293B"/>
-                <w:sz w:val="16"/>
-              </w:rPr>
-              <w:br/>
-              <w:t>}</w:t>
-            </w:r>
-            <w:r>
-              <w:rPr>
-                <w:rFonts w:ascii="Consolas" w:hAnsi="Consolas"/>
-                <w:color w:val="1E293B"/>
-                <w:sz w:val="16"/>
-              </w:rPr>
-              <w:br/>
-              <w:t>.facility-item img {</w:t>
-            </w:r>
-            <w:r>
-              <w:rPr>
-                <w:rFonts w:ascii="Consolas" w:hAnsi="Consolas"/>
-                <w:color w:val="1E293B"/>
-                <w:sz w:val="16"/>
-              </w:rPr>
-              <w:br/>
-              <w:t xml:space="preserve">  width: 100%; height: 100%; object-fit: cover;</w:t>
-            </w:r>
-            <w:r>
-              <w:rPr>
-                <w:rFonts w:ascii="Consolas" w:hAnsi="Consolas"/>
-                <w:color w:val="1E293B"/>
-                <w:sz w:val="16"/>
-              </w:rPr>
-              <w:br/>
-              <w:t xml:space="preserve">  transition: transform 0.5s ease;</w:t>
-            </w:r>
-            <w:r>
-              <w:rPr>
-                <w:rFonts w:ascii="Consolas" w:hAnsi="Consolas"/>
-                <w:color w:val="1E293B"/>
-                <w:sz w:val="16"/>
-              </w:rPr>
-              <w:br/>
-              <w:t>}</w:t>
-            </w:r>
-            <w:r>
-              <w:rPr>
-                <w:rFonts w:ascii="Consolas" w:hAnsi="Consolas"/>
-                <w:color w:val="1E293B"/>
-                <w:sz w:val="16"/>
-              </w:rPr>
-              <w:br/>
-            </w:r>
-            <w:r>
-              <w:rPr>
-                <w:rFonts w:ascii="Consolas" w:hAnsi="Consolas"/>
-                <w:color w:val="1E293B"/>
-                <w:sz w:val="16"/>
+                <w:sz w:val="15"/>
               </w:rPr>
               <w:t>.facility-item:hover img { transform: scale(1.08); }</w:t>
             </w:r>
@@ -3854,28 +3762,28 @@
     </w:p>
     <w:p>
       <w:pPr>
-        <w:spacing w:before="60" w:after="80"/>
+        <w:spacing w:before="40" w:after="60"/>
         <w:jc w:val="both"/>
       </w:pPr>
       <w:r>
         <w:rPr>
           <w:b/>
           <w:i/>
-          <w:sz w:val="19"/>
+          <w:sz w:val="23"/>
         </w:rPr>
         <w:t xml:space="preserve">Technical Insight: </w:t>
       </w:r>
       <w:r>
         <w:rPr>
           <w:i/>
-          <w:sz w:val="19"/>
+          <w:sz w:val="23"/>
         </w:rPr>
         <w:t>Documents certified textile machinery infrastructure—high-speed circular knitting cylinders, precision multi-needle overlock lines, and zero-discharge effluent treatment compliance.</w:t>
       </w:r>
     </w:p>
     <w:p>
       <w:pPr>
-        <w:spacing w:before="80" w:after="60"/>
+        <w:spacing w:before="40" w:after="40"/>
         <w:jc w:val="center"/>
       </w:pPr>
       <w:r>
@@ -3883,8 +3791,8 @@
           <w:noProof/>
         </w:rPr>
         <w:drawing>
-          <wp:inline distT="0" distB="0" distL="0" distR="0" wp14:anchorId="3EE4A11C" wp14:editId="640577A0">
-            <wp:extent cx="4846320" cy="2302002"/>
+          <wp:inline distT="0" distB="0" distL="0" distR="0" wp14:anchorId="5F3B27EF" wp14:editId="7B77D237">
+            <wp:extent cx="4663440" cy="2215134"/>
             <wp:effectExtent l="0" t="0" r="0" b="0"/>
             <wp:docPr id="10" name="Picture 10"/>
             <wp:cNvGraphicFramePr>
@@ -3906,7 +3814,7 @@
                   <pic:spPr>
                     <a:xfrm>
                       <a:off x="0" y="0"/>
-                      <a:ext cx="4846320" cy="2302002"/>
+                      <a:ext cx="4663440" cy="2215134"/>
                     </a:xfrm>
                     <a:prstGeom prst="rect">
                       <a:avLst/>
@@ -3921,14 +3829,14 @@
     </w:p>
     <w:p>
       <w:pPr>
-        <w:spacing w:before="20" w:after="80"/>
+        <w:spacing w:before="20" w:after="40"/>
         <w:jc w:val="center"/>
       </w:pPr>
       <w:r>
         <w:rPr>
           <w:i/>
           <w:color w:val="282828"/>
-          <w:sz w:val="19"/>
+          <w:sz w:val="21"/>
         </w:rPr>
         <w:t>Figure 5.8: Live Rendered Output – Tiruppur Manufacturing Facility &amp; Mill Production Infrastructure</w:t>
       </w:r>
@@ -3940,13 +3848,12 @@
     </w:p>
     <w:p>
       <w:pPr>
-        <w:spacing w:before="80" w:after="60"/>
+        <w:spacing w:before="40" w:after="40" w:line="300" w:lineRule="auto"/>
       </w:pPr>
       <w:r>
         <w:rPr>
           <w:b/>
           <w:color w:val="0F172A"/>
-          <w:sz w:val="23"/>
         </w:rPr>
         <w:lastRenderedPageBreak/>
         <w:t>5.9 B2B Wholesale Logistics Estimator &amp; WhatsApp Docket Compilation</w:t>
@@ -3960,7 +3867,7 @@
         <w:tblLook w:val="04A0" w:firstRow="1" w:lastRow="0" w:firstColumn="1" w:lastColumn="0" w:noHBand="0" w:noVBand="1"/>
       </w:tblPr>
       <w:tblGrid>
-        <w:gridCol w:w="9936"/>
+        <w:gridCol w:w="10080"/>
       </w:tblGrid>
       <w:tr>
         <w:trPr>
@@ -3968,7 +3875,7 @@
         </w:trPr>
         <w:tc>
           <w:tcPr>
-            <w:tcW w:w="9936" w:type="dxa"/>
+            <w:tcW w:w="10080" w:type="dxa"/>
             <w:tcBorders>
               <w:top w:val="single" w:sz="6" w:space="0" w:color="2B3545"/>
               <w:left w:val="single" w:sz="6" w:space="0" w:color="2B3545"/>
@@ -3977,15 +3884,15 @@
             </w:tcBorders>
             <w:shd w:val="clear" w:color="auto" w:fill="FBFBFD"/>
             <w:tcMar>
-              <w:top w:w="100" w:type="dxa"/>
-              <w:left w:w="140" w:type="dxa"/>
-              <w:bottom w:w="100" w:type="dxa"/>
-              <w:right w:w="140" w:type="dxa"/>
+              <w:top w:w="80" w:type="dxa"/>
+              <w:left w:w="120" w:type="dxa"/>
+              <w:bottom w:w="80" w:type="dxa"/>
+              <w:right w:w="120" w:type="dxa"/>
             </w:tcMar>
           </w:tcPr>
           <w:p>
             <w:pPr>
-              <w:spacing w:after="60" w:line="252" w:lineRule="auto"/>
+              <w:spacing w:after="40" w:line="252" w:lineRule="auto"/>
             </w:pPr>
             <w:r>
               <w:rPr>
@@ -4010,7 +3917,7 @@
                 <w:rFonts w:ascii="Consolas" w:hAnsi="Consolas"/>
                 <w:i/>
                 <w:color w:val="5A6978"/>
-                <w:sz w:val="16"/>
+                <w:sz w:val="15"/>
               </w:rPr>
               <w:t>// Zero-Database B2B WhatsApp Procurement Docket Generator</w:t>
             </w:r>
@@ -4019,7 +3926,7 @@
                 <w:rFonts w:ascii="Consolas" w:hAnsi="Consolas"/>
                 <w:i/>
                 <w:color w:val="5A6978"/>
-                <w:sz w:val="16"/>
+                <w:sz w:val="15"/>
               </w:rPr>
               <w:br/>
             </w:r>
@@ -4028,7 +3935,7 @@
                 <w:rFonts w:ascii="Consolas" w:hAnsi="Consolas"/>
                 <w:b/>
                 <w:color w:val="10326E"/>
-                <w:sz w:val="16"/>
+                <w:sz w:val="15"/>
               </w:rPr>
               <w:t>function generateProcurementDocket() {</w:t>
             </w:r>
@@ -4037,7 +3944,7 @@
                 <w:rFonts w:ascii="Consolas" w:hAnsi="Consolas"/>
                 <w:b/>
                 <w:color w:val="10326E"/>
-                <w:sz w:val="16"/>
+                <w:sz w:val="15"/>
               </w:rPr>
               <w:br/>
               <w:t xml:space="preserve">  const product = document.getElementById('b2b-product').value;</w:t>
@@ -4047,7 +3954,7 @@
                 <w:rFonts w:ascii="Consolas" w:hAnsi="Consolas"/>
                 <w:b/>
                 <w:color w:val="10326E"/>
-                <w:sz w:val="16"/>
+                <w:sz w:val="15"/>
               </w:rPr>
               <w:br/>
               <w:t xml:space="preserve">  const dozens = parseInt(document.getElementById('b2b-dozens').value) || 50;</w:t>
@@ -4057,7 +3964,7 @@
                 <w:rFonts w:ascii="Consolas" w:hAnsi="Consolas"/>
                 <w:b/>
                 <w:color w:val="10326E"/>
-                <w:sz w:val="16"/>
+                <w:sz w:val="15"/>
               </w:rPr>
               <w:br/>
               <w:t xml:space="preserve">  const tier = dozens &gt;= 500 ? 'Super Wholesale Tier 3' : (dozens &gt;= 150 ? 'Tier 2' : 'Standard Tier 1');</w:t>
@@ -4067,7 +3974,7 @@
                 <w:rFonts w:ascii="Consolas" w:hAnsi="Consolas"/>
                 <w:b/>
                 <w:color w:val="10326E"/>
-                <w:sz w:val="16"/>
+                <w:sz w:val="15"/>
               </w:rPr>
               <w:br/>
               <w:t xml:space="preserve">  const docketNumber = 'LBL-' + Math.floor(100000 + Math.random() * 900000);</w:t>
@@ -4077,7 +3984,7 @@
                 <w:rFonts w:ascii="Consolas" w:hAnsi="Consolas"/>
                 <w:b/>
                 <w:color w:val="10326E"/>
-                <w:sz w:val="16"/>
+                <w:sz w:val="15"/>
               </w:rPr>
               <w:br/>
             </w:r>
@@ -4086,7 +3993,7 @@
                 <w:rFonts w:ascii="Consolas" w:hAnsi="Consolas"/>
                 <w:b/>
                 <w:color w:val="10326E"/>
-                <w:sz w:val="16"/>
+                <w:sz w:val="15"/>
               </w:rPr>
               <w:t xml:space="preserve">  const docket = `*LBL HOSIERIES - B2B TRADE PROCUREMENT DOCKET*\n` +</w:t>
             </w:r>
@@ -4095,7 +4002,7 @@
                 <w:rFonts w:ascii="Consolas" w:hAnsi="Consolas"/>
                 <w:b/>
                 <w:color w:val="10326E"/>
-                <w:sz w:val="16"/>
+                <w:sz w:val="15"/>
               </w:rPr>
               <w:br/>
             </w:r>
@@ -4103,7 +4010,7 @@
               <w:rPr>
                 <w:rFonts w:ascii="Consolas" w:hAnsi="Consolas"/>
                 <w:color w:val="1E293B"/>
-                <w:sz w:val="16"/>
+                <w:sz w:val="15"/>
               </w:rPr>
               <w:t xml:space="preserve">    `*Docket Ref:* ${docketNumber}\n` +</w:t>
             </w:r>
@@ -4111,7 +4018,7 @@
               <w:rPr>
                 <w:rFonts w:ascii="Consolas" w:hAnsi="Consolas"/>
                 <w:color w:val="1E293B"/>
-                <w:sz w:val="16"/>
+                <w:sz w:val="15"/>
               </w:rPr>
               <w:br/>
               <w:t xml:space="preserve">    `*Product:* ${product}\n*Quantity:* ${dozens} Dozens (${dozens * 12} Pcs)\n` +</w:t>
@@ -4120,7 +4027,7 @@
               <w:rPr>
                 <w:rFonts w:ascii="Consolas" w:hAnsi="Consolas"/>
                 <w:color w:val="1E293B"/>
-                <w:sz w:val="16"/>
+                <w:sz w:val="15"/>
               </w:rPr>
               <w:br/>
               <w:t xml:space="preserve">    `*Procurement Tier:* ${tier}\n` +</w:t>
@@ -4129,7 +4036,7 @@
               <w:rPr>
                 <w:rFonts w:ascii="Consolas" w:hAnsi="Consolas"/>
                 <w:color w:val="1E293B"/>
-                <w:sz w:val="16"/>
+                <w:sz w:val="15"/>
               </w:rPr>
               <w:br/>
               <w:t xml:space="preserve">    `*Estimated Dispatch:* 48-72 Hours Ex-Mill Tiruppur\n` +</w:t>
@@ -4138,7 +4045,7 @@
               <w:rPr>
                 <w:rFonts w:ascii="Consolas" w:hAnsi="Consolas"/>
                 <w:color w:val="1E293B"/>
-                <w:sz w:val="16"/>
+                <w:sz w:val="15"/>
               </w:rPr>
               <w:br/>
               <w:t xml:space="preserve">    `*Timestamp:* ${new Date().toLocaleString()}`;</w:t>
@@ -4147,7 +4054,7 @@
               <w:rPr>
                 <w:rFonts w:ascii="Consolas" w:hAnsi="Consolas"/>
                 <w:color w:val="1E293B"/>
-                <w:sz w:val="16"/>
+                <w:sz w:val="15"/>
               </w:rPr>
               <w:br/>
             </w:r>
@@ -4156,7 +4063,7 @@
                 <w:rFonts w:ascii="Consolas" w:hAnsi="Consolas"/>
                 <w:b/>
                 <w:color w:val="10326E"/>
-                <w:sz w:val="16"/>
+                <w:sz w:val="15"/>
               </w:rPr>
               <w:t xml:space="preserve">  window.open(`https://wa.me/919944644555?text=${encodeURIComponent(docket)}`, '_blank');</w:t>
             </w:r>
@@ -4165,7 +4072,7 @@
                 <w:rFonts w:ascii="Consolas" w:hAnsi="Consolas"/>
                 <w:b/>
                 <w:color w:val="10326E"/>
-                <w:sz w:val="16"/>
+                <w:sz w:val="15"/>
               </w:rPr>
               <w:br/>
             </w:r>
@@ -4173,7 +4080,7 @@
               <w:rPr>
                 <w:rFonts w:ascii="Consolas" w:hAnsi="Consolas"/>
                 <w:color w:val="1E293B"/>
-                <w:sz w:val="16"/>
+                <w:sz w:val="15"/>
               </w:rPr>
               <w:t>}</w:t>
             </w:r>
@@ -4188,28 +4095,28 @@
     </w:p>
     <w:p>
       <w:pPr>
-        <w:spacing w:before="60" w:after="80"/>
+        <w:spacing w:before="40" w:after="60"/>
         <w:jc w:val="both"/>
       </w:pPr>
       <w:r>
         <w:rPr>
           <w:b/>
           <w:i/>
-          <w:sz w:val="19"/>
+          <w:sz w:val="23"/>
         </w:rPr>
         <w:t xml:space="preserve">Technical Insight: </w:t>
       </w:r>
       <w:r>
         <w:rPr>
           <w:i/>
-          <w:sz w:val="19"/>
+          <w:sz w:val="23"/>
         </w:rPr>
         <w:t>Performs real-time volume tier calculations and compiles formatted procurement dockets with cryptographic reference IDs directly into encrypted WhatsApp trade channels with zero cloud data storage.</w:t>
       </w:r>
     </w:p>
     <w:p>
       <w:pPr>
-        <w:spacing w:before="80" w:after="60"/>
+        <w:spacing w:before="40" w:after="40"/>
         <w:jc w:val="center"/>
       </w:pPr>
       <w:r>
@@ -4217,8 +4124,8 @@
           <w:noProof/>
         </w:rPr>
         <w:drawing>
-          <wp:inline distT="0" distB="0" distL="0" distR="0" wp14:anchorId="40CB27C4" wp14:editId="4CC16098">
-            <wp:extent cx="4846320" cy="2302002"/>
+          <wp:inline distT="0" distB="0" distL="0" distR="0" wp14:anchorId="3EC87261" wp14:editId="2AD8CA62">
+            <wp:extent cx="4663440" cy="2215134"/>
             <wp:effectExtent l="0" t="0" r="0" b="0"/>
             <wp:docPr id="11" name="Picture 11"/>
             <wp:cNvGraphicFramePr>
@@ -4240,7 +4147,7 @@
                   <pic:spPr>
                     <a:xfrm>
                       <a:off x="0" y="0"/>
-                      <a:ext cx="4846320" cy="2302002"/>
+                      <a:ext cx="4663440" cy="2215134"/>
                     </a:xfrm>
                     <a:prstGeom prst="rect">
                       <a:avLst/>
@@ -4255,14 +4162,14 @@
     </w:p>
     <w:p>
       <w:pPr>
-        <w:spacing w:before="20" w:after="80"/>
+        <w:spacing w:before="20" w:after="40"/>
         <w:jc w:val="center"/>
       </w:pPr>
       <w:r>
         <w:rPr>
           <w:i/>
           <w:color w:val="282828"/>
-          <w:sz w:val="19"/>
+          <w:sz w:val="21"/>
         </w:rPr>
         <w:t>Figure 5.9: Live Rendered Output – Wholesale Procurement Desk with Real-Time Logistics Dispatch Ribbon</w:t>
       </w:r>
@@ -4274,7 +4181,7 @@
     </w:p>
     <w:p>
       <w:pPr>
-        <w:spacing w:before="80" w:after="80"/>
+        <w:spacing w:before="40" w:after="60" w:line="300" w:lineRule="auto"/>
       </w:pPr>
       <w:r>
         <w:rPr>
@@ -4288,20 +4195,19 @@
     </w:p>
     <w:p>
       <w:pPr>
-        <w:spacing w:before="80" w:after="60"/>
+        <w:spacing w:before="40" w:after="40" w:line="300" w:lineRule="auto"/>
       </w:pPr>
       <w:r>
         <w:rPr>
           <w:b/>
           <w:color w:val="0F172A"/>
-          <w:sz w:val="23"/>
         </w:rPr>
         <w:t>6.1 Project Synthesis &amp; Technical Achievements</w:t>
       </w:r>
     </w:p>
     <w:p>
       <w:pPr>
-        <w:spacing w:before="80" w:after="160"/>
+        <w:spacing w:before="40" w:after="120"/>
         <w:jc w:val="both"/>
       </w:pPr>
       <w:r>
@@ -4313,7 +4219,7 @@
     </w:p>
     <w:p>
       <w:pPr>
-        <w:spacing w:before="80" w:after="240"/>
+        <w:spacing w:before="40" w:after="160"/>
         <w:jc w:val="both"/>
       </w:pPr>
       <w:r>
@@ -4325,20 +4231,19 @@
     </w:p>
     <w:p>
       <w:pPr>
-        <w:spacing w:before="80" w:after="60"/>
+        <w:spacing w:before="40" w:after="40" w:line="300" w:lineRule="auto"/>
       </w:pPr>
       <w:r>
         <w:rPr>
           <w:b/>
           <w:color w:val="0F172A"/>
-          <w:sz w:val="23"/>
         </w:rPr>
         <w:t>6.2 Future Scope &amp; Emerging Technologies</w:t>
       </w:r>
     </w:p>
     <w:p>
       <w:pPr>
-        <w:spacing w:before="60" w:after="120"/>
+        <w:spacing w:before="40" w:after="80"/>
         <w:jc w:val="both"/>
       </w:pPr>
       <w:r>
@@ -4347,7 +4252,7 @@
     </w:p>
     <w:p>
       <w:pPr>
-        <w:spacing w:before="40" w:after="80"/>
+        <w:spacing w:before="20" w:after="60"/>
         <w:ind w:left="360"/>
         <w:jc w:val="both"/>
       </w:pPr>
@@ -4363,7 +4268,7 @@
     </w:p>
     <w:p>
       <w:pPr>
-        <w:spacing w:before="40" w:after="80"/>
+        <w:spacing w:before="20" w:after="60"/>
         <w:ind w:left="360"/>
         <w:jc w:val="both"/>
       </w:pPr>
@@ -4385,7 +4290,7 @@
     </w:p>
     <w:p>
       <w:pPr>
-        <w:spacing w:before="40" w:after="80"/>
+        <w:spacing w:before="20" w:after="60"/>
         <w:ind w:left="360"/>
         <w:jc w:val="both"/>
       </w:pPr>
@@ -4401,7 +4306,7 @@
     </w:p>
     <w:sectPr>
       <w:pgSz w:w="12240" w:h="15840"/>
-      <w:pgMar w:top="1080" w:right="1152" w:bottom="1080" w:left="1152" w:header="576" w:footer="576" w:gutter="0"/>
+      <w:pgMar w:top="936" w:right="1080" w:bottom="936" w:left="1080" w:header="504" w:footer="504" w:gutter="0"/>
       <w:pgBorders w:offsetFrom="page">
         <w:top w:val="single" w:sz="6" w:space="24" w:color="333333"/>
         <w:left w:val="single" w:sz="6" w:space="24" w:color="333333"/>
@@ -4588,31 +4493,31 @@
       </w:rPr>
     </w:lvl>
   </w:abstractNum>
-  <w:num w:numId="1" w16cid:durableId="465664050">
+  <w:num w:numId="1" w16cid:durableId="1492015192">
     <w:abstractNumId w:val="8"/>
   </w:num>
-  <w:num w:numId="2" w16cid:durableId="424618558">
+  <w:num w:numId="2" w16cid:durableId="392388600">
     <w:abstractNumId w:val="6"/>
   </w:num>
-  <w:num w:numId="3" w16cid:durableId="1983729581">
+  <w:num w:numId="3" w16cid:durableId="1538470202">
     <w:abstractNumId w:val="5"/>
   </w:num>
-  <w:num w:numId="4" w16cid:durableId="787045100">
+  <w:num w:numId="4" w16cid:durableId="757870247">
     <w:abstractNumId w:val="4"/>
   </w:num>
-  <w:num w:numId="5" w16cid:durableId="792867999">
+  <w:num w:numId="5" w16cid:durableId="1433696916">
     <w:abstractNumId w:val="7"/>
   </w:num>
-  <w:num w:numId="6" w16cid:durableId="1623614062">
+  <w:num w:numId="6" w16cid:durableId="269511141">
     <w:abstractNumId w:val="3"/>
   </w:num>
-  <w:num w:numId="7" w16cid:durableId="569190500">
+  <w:num w:numId="7" w16cid:durableId="211114517">
     <w:abstractNumId w:val="2"/>
   </w:num>
-  <w:num w:numId="8" w16cid:durableId="1297833450">
+  <w:num w:numId="8" w16cid:durableId="2041588010">
     <w:abstractNumId w:val="1"/>
   </w:num>
-  <w:num w:numId="9" w16cid:durableId="1652557163">
+  <w:num w:numId="9" w16cid:durableId="1008485758">
     <w:abstractNumId w:val="0"/>
   </w:num>
 </w:numbering>
@@ -5008,10 +4913,13 @@
     <w:name w:val="Normal"/>
     <w:qFormat/>
     <w:rsid w:val="00FC693F"/>
+    <w:pPr>
+      <w:spacing w:line="360" w:lineRule="auto"/>
+    </w:pPr>
     <w:rPr>
       <w:rFonts w:ascii="Times New Roman" w:hAnsi="Times New Roman"/>
-      <w:color w:val="1E1E1E"/>
-      <w:sz w:val="21"/>
+      <w:color w:val="141414"/>
+      <w:sz w:val="24"/>
     </w:rPr>
   </w:style>
   <w:style w:type="paragraph" w:styleId="Heading1">
@@ -5404,7 +5312,6 @@
       <w:iCs/>
       <w:color w:val="4F81BD" w:themeColor="accent1"/>
       <w:spacing w:val="15"/>
-      <w:sz w:val="24"/>
       <w:szCs w:val="24"/>
     </w:rPr>
   </w:style>

</xml_diff>